<commit_message>
test(table): regenerate docs/test-output.docx with table fix applied
Replaces bug-era sample (38K) with fixed output (73K). All 2 tables
in the sample now pass scripts/verify-table-xml.js (5/5 checks).

Manual QuickLook visual verification confirmed: tables render at full
page width (no longer compressed to left-side narrow strip).

Verified against multiple templates: academic_paper_en,
tech_report_blue, staff_handbook_cn — all pass.

Boundary cases verified:
- 10-col wide table: 902×9+908=9026 (perfect remainder absorption)
- HTML colspan=2: tcW=6016 + gridSpan=2 correctly emitted
- HTML rowspan=2: docx auto-inserts CONTINUE cell with vMerge

PDF path (bin/capture.js) regression-tested: 36M PDF generated OK.

Co-Authored-By: Claude Opus 4.7 <noreply@anthropic.com>
</commit_message>
<xml_diff>
--- a/docs/test-output.docx
+++ b/docs/test-output.docx
@@ -10,6 +10,7 @@
       </w:pPr>
       <w:r>
         <w:rPr>
+          <w:rFonts w:ascii="Calibri" w:cs="Calibri" w:eastAsia="Calibri" w:hAnsi="Calibri"/>
           <w:b/>
           <w:bCs/>
           <w:color w:val="000000"/>
@@ -21,16 +22,19 @@
     </w:p>
     <w:p>
       <w:pPr>
-        <w:spacing w:before="0" w:after="0"/>
-      </w:pPr>
-      <w:r>
-        <w:rPr>
-          <w:b w:val="false"/>
-          <w:bCs w:val="false"/>
-          <w:i w:val="false"/>
-          <w:iCs w:val="false"/>
-          <w:strike w:val="false"/>
-          <w:color w:val="000000"/>
+        <w:spacing w:line="240" w:before="0" w:after="0"/>
+      </w:pPr>
+      <w:r>
+        <w:rPr>
+          <w:rFonts w:ascii="Calibri" w:cs="Calibri" w:eastAsia="Calibri" w:hAnsi="Calibri"/>
+          <w:b w:val="false"/>
+          <w:bCs w:val="false"/>
+          <w:i w:val="false"/>
+          <w:iCs w:val="false"/>
+          <w:strike w:val="false"/>
+          <w:color w:val="000000"/>
+          <w:sz w:val="24"/>
+          <w:szCs w:val="24"/>
         </w:rPr>
         <w:t xml:space="preserve">这是一个用于测试所有 Markdown 格式支持的综合测试文档。</w:t>
       </w:r>
@@ -42,6 +46,7 @@
       </w:pPr>
       <w:r>
         <w:rPr>
+          <w:rFonts w:ascii="Calibri" w:cs="Calibri" w:eastAsia="Calibri" w:hAnsi="Calibri"/>
           <w:b/>
           <w:bCs/>
           <w:color w:val="000000"/>
@@ -58,6 +63,7 @@
       </w:pPr>
       <w:r>
         <w:rPr>
+          <w:rFonts w:ascii="Calibri" w:cs="Calibri" w:eastAsia="Calibri" w:hAnsi="Calibri"/>
           <w:b/>
           <w:bCs/>
           <w:color w:val="000000"/>
@@ -69,104 +75,131 @@
     </w:p>
     <w:p>
       <w:pPr>
-        <w:spacing w:before="0" w:after="0"/>
-      </w:pPr>
-      <w:r>
-        <w:rPr>
-          <w:b w:val="false"/>
-          <w:bCs w:val="false"/>
-          <w:i w:val="false"/>
-          <w:iCs w:val="false"/>
-          <w:strike w:val="false"/>
-          <w:color w:val="000000"/>
+        <w:spacing w:line="240" w:before="0" w:after="0"/>
+      </w:pPr>
+      <w:r>
+        <w:rPr>
+          <w:rFonts w:ascii="Calibri" w:cs="Calibri" w:eastAsia="Calibri" w:hAnsi="Calibri"/>
+          <w:b w:val="false"/>
+          <w:bCs w:val="false"/>
+          <w:i w:val="false"/>
+          <w:iCs w:val="false"/>
+          <w:strike w:val="false"/>
+          <w:color w:val="000000"/>
+          <w:sz w:val="24"/>
+          <w:szCs w:val="24"/>
         </w:rPr>
         <w:t xml:space="preserve">这是</w:t>
       </w:r>
       <w:r>
         <w:rPr>
+          <w:rFonts w:ascii="Calibri" w:cs="Calibri" w:eastAsia="Calibri" w:hAnsi="Calibri"/>
           <w:b/>
           <w:bCs/>
           <w:i w:val="false"/>
           <w:iCs w:val="false"/>
           <w:strike w:val="false"/>
           <w:color w:val="000000"/>
+          <w:sz w:val="24"/>
+          <w:szCs w:val="24"/>
         </w:rPr>
         <w:t xml:space="preserve">粗体文本</w:t>
       </w:r>
       <w:r>
         <w:rPr>
-          <w:b w:val="false"/>
-          <w:bCs w:val="false"/>
-          <w:i w:val="false"/>
-          <w:iCs w:val="false"/>
-          <w:strike w:val="false"/>
-          <w:color w:val="000000"/>
+          <w:rFonts w:ascii="Calibri" w:cs="Calibri" w:eastAsia="Calibri" w:hAnsi="Calibri"/>
+          <w:b w:val="false"/>
+          <w:bCs w:val="false"/>
+          <w:i w:val="false"/>
+          <w:iCs w:val="false"/>
+          <w:strike w:val="false"/>
+          <w:color w:val="000000"/>
+          <w:sz w:val="24"/>
+          <w:szCs w:val="24"/>
         </w:rPr>
         <w:t xml:space="preserve">，这是</w:t>
       </w:r>
       <w:r>
         <w:rPr>
+          <w:rFonts w:ascii="Calibri" w:cs="Calibri" w:eastAsia="Calibri" w:hAnsi="Calibri"/>
           <w:b w:val="false"/>
           <w:bCs w:val="false"/>
           <w:i/>
           <w:iCs/>
           <w:strike w:val="false"/>
           <w:color w:val="000000"/>
+          <w:sz w:val="24"/>
+          <w:szCs w:val="24"/>
         </w:rPr>
         <w:t xml:space="preserve">斜体文本</w:t>
       </w:r>
       <w:r>
         <w:rPr>
-          <w:b w:val="false"/>
-          <w:bCs w:val="false"/>
-          <w:i w:val="false"/>
-          <w:iCs w:val="false"/>
-          <w:strike w:val="false"/>
-          <w:color w:val="000000"/>
+          <w:rFonts w:ascii="Calibri" w:cs="Calibri" w:eastAsia="Calibri" w:hAnsi="Calibri"/>
+          <w:b w:val="false"/>
+          <w:bCs w:val="false"/>
+          <w:i w:val="false"/>
+          <w:iCs w:val="false"/>
+          <w:strike w:val="false"/>
+          <w:color w:val="000000"/>
+          <w:sz w:val="24"/>
+          <w:szCs w:val="24"/>
         </w:rPr>
         <w:t xml:space="preserve">，这是</w:t>
       </w:r>
       <w:r>
         <w:rPr>
+          <w:rFonts w:ascii="Calibri" w:cs="Calibri" w:eastAsia="Calibri" w:hAnsi="Calibri"/>
           <w:b w:val="false"/>
           <w:bCs w:val="false"/>
           <w:i/>
           <w:iCs/>
           <w:strike w:val="false"/>
           <w:color w:val="000000"/>
+          <w:sz w:val="24"/>
+          <w:szCs w:val="24"/>
         </w:rPr>
         <w:t xml:space="preserve"/>
       </w:r>
       <w:r>
         <w:rPr>
+          <w:rFonts w:ascii="Calibri" w:cs="Calibri" w:eastAsia="Calibri" w:hAnsi="Calibri"/>
           <w:b/>
           <w:bCs/>
           <w:i/>
           <w:iCs/>
           <w:strike w:val="false"/>
           <w:color w:val="000000"/>
+          <w:sz w:val="24"/>
+          <w:szCs w:val="24"/>
         </w:rPr>
         <w:t xml:space="preserve">粗斜体</w:t>
       </w:r>
       <w:r>
         <w:rPr>
+          <w:rFonts w:ascii="Calibri" w:cs="Calibri" w:eastAsia="Calibri" w:hAnsi="Calibri"/>
           <w:b w:val="false"/>
           <w:bCs w:val="false"/>
           <w:i/>
           <w:iCs/>
           <w:strike w:val="false"/>
           <w:color w:val="000000"/>
+          <w:sz w:val="24"/>
+          <w:szCs w:val="24"/>
         </w:rPr>
         <w:t xml:space="preserve"/>
       </w:r>
       <w:r>
         <w:rPr>
-          <w:b w:val="false"/>
-          <w:bCs w:val="false"/>
-          <w:i w:val="false"/>
-          <w:iCs w:val="false"/>
-          <w:strike w:val="false"/>
-          <w:color w:val="000000"/>
+          <w:rFonts w:ascii="Calibri" w:cs="Calibri" w:eastAsia="Calibri" w:hAnsi="Calibri"/>
+          <w:b w:val="false"/>
+          <w:bCs w:val="false"/>
+          <w:i w:val="false"/>
+          <w:iCs w:val="false"/>
+          <w:strike w:val="false"/>
+          <w:color w:val="000000"/>
+          <w:sz w:val="24"/>
+          <w:szCs w:val="24"/>
         </w:rPr>
         <w:t xml:space="preserve">。</w:t>
       </w:r>
@@ -178,6 +211,7 @@
       </w:pPr>
       <w:r>
         <w:rPr>
+          <w:rFonts w:ascii="Calibri" w:cs="Calibri" w:eastAsia="Calibri" w:hAnsi="Calibri"/>
           <w:b/>
           <w:bCs/>
           <w:color w:val="000000"/>
@@ -189,60 +223,75 @@
     </w:p>
     <w:p>
       <w:pPr>
-        <w:spacing w:before="0" w:after="0"/>
-      </w:pPr>
-      <w:r>
-        <w:rPr>
-          <w:b w:val="false"/>
-          <w:bCs w:val="false"/>
-          <w:i w:val="false"/>
-          <w:iCs w:val="false"/>
-          <w:strike w:val="false"/>
-          <w:color w:val="000000"/>
+        <w:spacing w:line="240" w:before="0" w:after="0"/>
+      </w:pPr>
+      <w:r>
+        <w:rPr>
+          <w:rFonts w:ascii="Calibri" w:cs="Calibri" w:eastAsia="Calibri" w:hAnsi="Calibri"/>
+          <w:b w:val="false"/>
+          <w:bCs w:val="false"/>
+          <w:i w:val="false"/>
+          <w:iCs w:val="false"/>
+          <w:strike w:val="false"/>
+          <w:color w:val="000000"/>
+          <w:sz w:val="24"/>
+          <w:szCs w:val="24"/>
         </w:rPr>
         <w:t xml:space="preserve">这是</w:t>
       </w:r>
       <w:r>
         <w:rPr>
+          <w:rFonts w:ascii="Calibri" w:cs="Calibri" w:eastAsia="Calibri" w:hAnsi="Calibri"/>
           <w:b w:val="false"/>
           <w:bCs w:val="false"/>
           <w:i w:val="false"/>
           <w:iCs w:val="false"/>
           <w:strike/>
           <w:color w:val="000000"/>
+          <w:sz w:val="24"/>
+          <w:szCs w:val="24"/>
         </w:rPr>
         <w:t xml:space="preserve">删除线文本</w:t>
       </w:r>
       <w:r>
         <w:rPr>
-          <w:b w:val="false"/>
-          <w:bCs w:val="false"/>
-          <w:i w:val="false"/>
-          <w:iCs w:val="false"/>
-          <w:strike w:val="false"/>
-          <w:color w:val="000000"/>
+          <w:rFonts w:ascii="Calibri" w:cs="Calibri" w:eastAsia="Calibri" w:hAnsi="Calibri"/>
+          <w:b w:val="false"/>
+          <w:bCs w:val="false"/>
+          <w:i w:val="false"/>
+          <w:iCs w:val="false"/>
+          <w:strike w:val="false"/>
+          <w:color w:val="000000"/>
+          <w:sz w:val="24"/>
+          <w:szCs w:val="24"/>
         </w:rPr>
         <w:t xml:space="preserve">，可以和**粗体</w:t>
       </w:r>
       <w:r>
         <w:rPr>
+          <w:rFonts w:ascii="Calibri" w:cs="Calibri" w:eastAsia="Calibri" w:hAnsi="Calibri"/>
           <w:b w:val="false"/>
           <w:bCs w:val="false"/>
           <w:i w:val="false"/>
           <w:iCs w:val="false"/>
           <w:strike/>
           <w:color w:val="000000"/>
+          <w:sz w:val="24"/>
+          <w:szCs w:val="24"/>
         </w:rPr>
         <w:t xml:space="preserve">组合</w:t>
       </w:r>
       <w:r>
         <w:rPr>
-          <w:b w:val="false"/>
-          <w:bCs w:val="false"/>
-          <w:i w:val="false"/>
-          <w:iCs w:val="false"/>
-          <w:strike w:val="false"/>
-          <w:color w:val="000000"/>
+          <w:rFonts w:ascii="Calibri" w:cs="Calibri" w:eastAsia="Calibri" w:hAnsi="Calibri"/>
+          <w:b w:val="false"/>
+          <w:bCs w:val="false"/>
+          <w:i w:val="false"/>
+          <w:iCs w:val="false"/>
+          <w:strike w:val="false"/>
+          <w:color w:val="000000"/>
+          <w:sz w:val="24"/>
+          <w:szCs w:val="24"/>
         </w:rPr>
         <w:t xml:space="preserve">**使用。</w:t>
       </w:r>
@@ -254,6 +303,7 @@
       </w:pPr>
       <w:r>
         <w:rPr>
+          <w:rFonts w:ascii="Calibri" w:cs="Calibri" w:eastAsia="Calibri" w:hAnsi="Calibri"/>
           <w:b/>
           <w:bCs/>
           <w:color w:val="000000"/>
@@ -265,50 +315,62 @@
     </w:p>
     <w:p>
       <w:pPr>
-        <w:spacing w:before="0" w:after="0"/>
-      </w:pPr>
-      <w:r>
-        <w:rPr>
-          <w:b w:val="false"/>
-          <w:bCs w:val="false"/>
-          <w:i w:val="false"/>
-          <w:iCs w:val="false"/>
-          <w:strike w:val="false"/>
-          <w:color w:val="000000"/>
+        <w:spacing w:line="240" w:before="0" w:after="0"/>
+      </w:pPr>
+      <w:r>
+        <w:rPr>
+          <w:rFonts w:ascii="Calibri" w:cs="Calibri" w:eastAsia="Calibri" w:hAnsi="Calibri"/>
+          <w:b w:val="false"/>
+          <w:bCs w:val="false"/>
+          <w:i w:val="false"/>
+          <w:iCs w:val="false"/>
+          <w:strike w:val="false"/>
+          <w:color w:val="000000"/>
+          <w:sz w:val="24"/>
+          <w:szCs w:val="24"/>
         </w:rPr>
         <w:t xml:space="preserve">化学式：H</w:t>
       </w:r>
       <w:r>
         <w:rPr>
-          <w:b w:val="false"/>
-          <w:bCs w:val="false"/>
-          <w:i w:val="false"/>
-          <w:iCs w:val="false"/>
-          <w:strike w:val="false"/>
-          <w:color w:val="000000"/>
+          <w:rFonts w:ascii="Calibri" w:cs="Calibri" w:eastAsia="Calibri" w:hAnsi="Calibri"/>
+          <w:b w:val="false"/>
+          <w:bCs w:val="false"/>
+          <w:i w:val="false"/>
+          <w:iCs w:val="false"/>
+          <w:strike w:val="false"/>
+          <w:color w:val="000000"/>
+          <w:sz w:val="24"/>
+          <w:szCs w:val="24"/>
           <w:vertAlign w:val="subscript"/>
         </w:rPr>
         <w:t xml:space="preserve">2</w:t>
       </w:r>
       <w:r>
         <w:rPr>
-          <w:b w:val="false"/>
-          <w:bCs w:val="false"/>
-          <w:i w:val="false"/>
-          <w:iCs w:val="false"/>
-          <w:strike w:val="false"/>
-          <w:color w:val="000000"/>
+          <w:rFonts w:ascii="Calibri" w:cs="Calibri" w:eastAsia="Calibri" w:hAnsi="Calibri"/>
+          <w:b w:val="false"/>
+          <w:bCs w:val="false"/>
+          <w:i w:val="false"/>
+          <w:iCs w:val="false"/>
+          <w:strike w:val="false"/>
+          <w:color w:val="000000"/>
+          <w:sz w:val="24"/>
+          <w:szCs w:val="24"/>
         </w:rPr>
         <w:t xml:space="preserve">O，CO</w:t>
       </w:r>
       <w:r>
         <w:rPr>
-          <w:b w:val="false"/>
-          <w:bCs w:val="false"/>
-          <w:i w:val="false"/>
-          <w:iCs w:val="false"/>
-          <w:strike w:val="false"/>
-          <w:color w:val="000000"/>
+          <w:rFonts w:ascii="Calibri" w:cs="Calibri" w:eastAsia="Calibri" w:hAnsi="Calibri"/>
+          <w:b w:val="false"/>
+          <w:bCs w:val="false"/>
+          <w:i w:val="false"/>
+          <w:iCs w:val="false"/>
+          <w:strike w:val="false"/>
+          <w:color w:val="000000"/>
+          <w:sz w:val="24"/>
+          <w:szCs w:val="24"/>
           <w:vertAlign w:val="subscript"/>
         </w:rPr>
         <w:t xml:space="preserve">2</w:t>
@@ -316,73 +378,91 @@
     </w:p>
     <w:p>
       <w:pPr>
-        <w:spacing w:before="0" w:after="0"/>
-      </w:pPr>
-      <w:r>
-        <w:rPr>
-          <w:b w:val="false"/>
-          <w:bCs w:val="false"/>
-          <w:i w:val="false"/>
-          <w:iCs w:val="false"/>
-          <w:strike w:val="false"/>
-          <w:color w:val="000000"/>
+        <w:spacing w:line="240" w:before="0" w:after="0"/>
+      </w:pPr>
+      <w:r>
+        <w:rPr>
+          <w:rFonts w:ascii="Calibri" w:cs="Calibri" w:eastAsia="Calibri" w:hAnsi="Calibri"/>
+          <w:b w:val="false"/>
+          <w:bCs w:val="false"/>
+          <w:i w:val="false"/>
+          <w:iCs w:val="false"/>
+          <w:strike w:val="false"/>
+          <w:color w:val="000000"/>
+          <w:sz w:val="24"/>
+          <w:szCs w:val="24"/>
         </w:rPr>
         <w:t xml:space="preserve">数学公式：x</w:t>
       </w:r>
       <w:r>
         <w:rPr>
-          <w:b w:val="false"/>
-          <w:bCs w:val="false"/>
-          <w:i w:val="false"/>
-          <w:iCs w:val="false"/>
-          <w:strike w:val="false"/>
-          <w:color w:val="000000"/>
+          <w:rFonts w:ascii="Calibri" w:cs="Calibri" w:eastAsia="Calibri" w:hAnsi="Calibri"/>
+          <w:b w:val="false"/>
+          <w:bCs w:val="false"/>
+          <w:i w:val="false"/>
+          <w:iCs w:val="false"/>
+          <w:strike w:val="false"/>
+          <w:color w:val="000000"/>
+          <w:sz w:val="24"/>
+          <w:szCs w:val="24"/>
           <w:vertAlign w:val="superscript"/>
         </w:rPr>
         <w:t xml:space="preserve">2</w:t>
       </w:r>
       <w:r>
         <w:rPr>
-          <w:b w:val="false"/>
-          <w:bCs w:val="false"/>
-          <w:i w:val="false"/>
-          <w:iCs w:val="false"/>
-          <w:strike w:val="false"/>
-          <w:color w:val="000000"/>
+          <w:rFonts w:ascii="Calibri" w:cs="Calibri" w:eastAsia="Calibri" w:hAnsi="Calibri"/>
+          <w:b w:val="false"/>
+          <w:bCs w:val="false"/>
+          <w:i w:val="false"/>
+          <w:iCs w:val="false"/>
+          <w:strike w:val="false"/>
+          <w:color w:val="000000"/>
+          <w:sz w:val="24"/>
+          <w:szCs w:val="24"/>
         </w:rPr>
         <w:t xml:space="preserve"> + y</w:t>
       </w:r>
       <w:r>
         <w:rPr>
-          <w:b w:val="false"/>
-          <w:bCs w:val="false"/>
-          <w:i w:val="false"/>
-          <w:iCs w:val="false"/>
-          <w:strike w:val="false"/>
-          <w:color w:val="000000"/>
+          <w:rFonts w:ascii="Calibri" w:cs="Calibri" w:eastAsia="Calibri" w:hAnsi="Calibri"/>
+          <w:b w:val="false"/>
+          <w:bCs w:val="false"/>
+          <w:i w:val="false"/>
+          <w:iCs w:val="false"/>
+          <w:strike w:val="false"/>
+          <w:color w:val="000000"/>
+          <w:sz w:val="24"/>
+          <w:szCs w:val="24"/>
           <w:vertAlign w:val="superscript"/>
         </w:rPr>
         <w:t xml:space="preserve">2</w:t>
       </w:r>
       <w:r>
         <w:rPr>
-          <w:b w:val="false"/>
-          <w:bCs w:val="false"/>
-          <w:i w:val="false"/>
-          <w:iCs w:val="false"/>
-          <w:strike w:val="false"/>
-          <w:color w:val="000000"/>
+          <w:rFonts w:ascii="Calibri" w:cs="Calibri" w:eastAsia="Calibri" w:hAnsi="Calibri"/>
+          <w:b w:val="false"/>
+          <w:bCs w:val="false"/>
+          <w:i w:val="false"/>
+          <w:iCs w:val="false"/>
+          <w:strike w:val="false"/>
+          <w:color w:val="000000"/>
+          <w:sz w:val="24"/>
+          <w:szCs w:val="24"/>
         </w:rPr>
         <w:t xml:space="preserve"> = z</w:t>
       </w:r>
       <w:r>
         <w:rPr>
-          <w:b w:val="false"/>
-          <w:bCs w:val="false"/>
-          <w:i w:val="false"/>
-          <w:iCs w:val="false"/>
-          <w:strike w:val="false"/>
-          <w:color w:val="000000"/>
+          <w:rFonts w:ascii="Calibri" w:cs="Calibri" w:eastAsia="Calibri" w:hAnsi="Calibri"/>
+          <w:b w:val="false"/>
+          <w:bCs w:val="false"/>
+          <w:i w:val="false"/>
+          <w:iCs w:val="false"/>
+          <w:strike w:val="false"/>
+          <w:color w:val="000000"/>
+          <w:sz w:val="24"/>
+          <w:szCs w:val="24"/>
           <w:vertAlign w:val="superscript"/>
         </w:rPr>
         <w:t xml:space="preserve">2</w:t>
@@ -390,27 +470,33 @@
     </w:p>
     <w:p>
       <w:pPr>
-        <w:spacing w:before="0" w:after="0"/>
-      </w:pPr>
-      <w:r>
-        <w:rPr>
-          <w:b w:val="false"/>
-          <w:bCs w:val="false"/>
-          <w:i w:val="false"/>
-          <w:iCs w:val="false"/>
-          <w:strike w:val="false"/>
-          <w:color w:val="000000"/>
+        <w:spacing w:line="240" w:before="0" w:after="0"/>
+      </w:pPr>
+      <w:r>
+        <w:rPr>
+          <w:rFonts w:ascii="Calibri" w:cs="Calibri" w:eastAsia="Calibri" w:hAnsi="Calibri"/>
+          <w:b w:val="false"/>
+          <w:bCs w:val="false"/>
+          <w:i w:val="false"/>
+          <w:iCs w:val="false"/>
+          <w:strike w:val="false"/>
+          <w:color w:val="000000"/>
+          <w:sz w:val="24"/>
+          <w:szCs w:val="24"/>
         </w:rPr>
         <w:t xml:space="preserve">E = mc</w:t>
       </w:r>
       <w:r>
         <w:rPr>
-          <w:b w:val="false"/>
-          <w:bCs w:val="false"/>
-          <w:i w:val="false"/>
-          <w:iCs w:val="false"/>
-          <w:strike w:val="false"/>
-          <w:color w:val="000000"/>
+          <w:rFonts w:ascii="Calibri" w:cs="Calibri" w:eastAsia="Calibri" w:hAnsi="Calibri"/>
+          <w:b w:val="false"/>
+          <w:bCs w:val="false"/>
+          <w:i w:val="false"/>
+          <w:iCs w:val="false"/>
+          <w:strike w:val="false"/>
+          <w:color w:val="000000"/>
+          <w:sz w:val="24"/>
+          <w:szCs w:val="24"/>
           <w:vertAlign w:val="superscript"/>
         </w:rPr>
         <w:t xml:space="preserve">2</w:t>
@@ -431,6 +517,7 @@
       </w:pPr>
       <w:r>
         <w:rPr>
+          <w:rFonts w:ascii="Calibri" w:cs="Calibri" w:eastAsia="Calibri" w:hAnsi="Calibri"/>
           <w:b/>
           <w:bCs/>
           <w:color w:val="000000"/>
@@ -442,16 +529,19 @@
     </w:p>
     <w:p>
       <w:pPr>
-        <w:spacing w:before="0" w:after="0"/>
-      </w:pPr>
-      <w:r>
-        <w:rPr>
-          <w:b w:val="false"/>
-          <w:bCs w:val="false"/>
-          <w:i w:val="false"/>
-          <w:iCs w:val="false"/>
-          <w:strike w:val="false"/>
-          <w:color w:val="000000"/>
+        <w:spacing w:line="240" w:before="0" w:after="0"/>
+      </w:pPr>
+      <w:r>
+        <w:rPr>
+          <w:rFonts w:ascii="Calibri" w:cs="Calibri" w:eastAsia="Calibri" w:hAnsi="Calibri"/>
+          <w:b w:val="false"/>
+          <w:bCs w:val="false"/>
+          <w:i w:val="false"/>
+          <w:iCs w:val="false"/>
+          <w:strike w:val="false"/>
+          <w:color w:val="000000"/>
+          <w:sz w:val="24"/>
+          <w:szCs w:val="24"/>
         </w:rPr>
         <w:t xml:space="preserve">上面是一条分隔线，下面还有一条：</w:t>
       </w:r>
@@ -466,16 +556,19 @@
     </w:p>
     <w:p>
       <w:pPr>
-        <w:spacing w:before="0" w:after="0"/>
-      </w:pPr>
-      <w:r>
-        <w:rPr>
-          <w:b w:val="false"/>
-          <w:bCs w:val="false"/>
-          <w:i w:val="false"/>
-          <w:iCs w:val="false"/>
-          <w:strike w:val="false"/>
-          <w:color w:val="000000"/>
+        <w:spacing w:line="240" w:before="0" w:after="0"/>
+      </w:pPr>
+      <w:r>
+        <w:rPr>
+          <w:rFonts w:ascii="Calibri" w:cs="Calibri" w:eastAsia="Calibri" w:hAnsi="Calibri"/>
+          <w:b w:val="false"/>
+          <w:bCs w:val="false"/>
+          <w:i w:val="false"/>
+          <w:iCs w:val="false"/>
+          <w:strike w:val="false"/>
+          <w:color w:val="000000"/>
+          <w:sz w:val="24"/>
+          <w:szCs w:val="24"/>
         </w:rPr>
         <w:t xml:space="preserve">分隔线测试完成。</w:t>
       </w:r>
@@ -495,6 +588,7 @@
       </w:pPr>
       <w:r>
         <w:rPr>
+          <w:rFonts w:ascii="Calibri" w:cs="Calibri" w:eastAsia="Calibri" w:hAnsi="Calibri"/>
           <w:b/>
           <w:bCs/>
           <w:color w:val="000000"/>
@@ -515,12 +609,15 @@
       </w:pPr>
       <w:r>
         <w:rPr>
-          <w:b w:val="false"/>
-          <w:bCs w:val="false"/>
-          <w:i w:val="false"/>
-          <w:iCs w:val="false"/>
-          <w:strike w:val="false"/>
-          <w:color w:val="000000"/>
+          <w:rFonts w:ascii="Calibri" w:cs="Calibri" w:eastAsia="Calibri" w:hAnsi="Calibri"/>
+          <w:b w:val="false"/>
+          <w:bCs w:val="false"/>
+          <w:i w:val="false"/>
+          <w:iCs w:val="false"/>
+          <w:strike w:val="false"/>
+          <w:color w:val="000000"/>
+          <w:sz w:val="24"/>
+          <w:szCs w:val="24"/>
         </w:rPr>
         <w:t xml:space="preserve">这是一级引用。</w:t>
       </w:r>
@@ -529,56 +626,71 @@
       </w:r>
       <w:r>
         <w:rPr>
-          <w:b w:val="false"/>
-          <w:bCs w:val="false"/>
-          <w:i w:val="false"/>
-          <w:iCs w:val="false"/>
-          <w:strike w:val="false"/>
-          <w:color w:val="000000"/>
+          <w:rFonts w:ascii="Calibri" w:cs="Calibri" w:eastAsia="Calibri" w:hAnsi="Calibri"/>
+          <w:b w:val="false"/>
+          <w:bCs w:val="false"/>
+          <w:i w:val="false"/>
+          <w:iCs w:val="false"/>
+          <w:strike w:val="false"/>
+          <w:color w:val="000000"/>
+          <w:sz w:val="24"/>
+          <w:szCs w:val="24"/>
         </w:rPr>
         <w:t xml:space="preserve">引用可以包含</w:t>
       </w:r>
       <w:r>
         <w:rPr>
+          <w:rFonts w:ascii="Calibri" w:cs="Calibri" w:eastAsia="Calibri" w:hAnsi="Calibri"/>
           <w:b/>
           <w:bCs/>
           <w:i w:val="false"/>
           <w:iCs w:val="false"/>
           <w:strike w:val="false"/>
           <w:color w:val="000000"/>
+          <w:sz w:val="24"/>
+          <w:szCs w:val="24"/>
         </w:rPr>
         <w:t xml:space="preserve">粗体</w:t>
       </w:r>
       <w:r>
         <w:rPr>
-          <w:b w:val="false"/>
-          <w:bCs w:val="false"/>
-          <w:i w:val="false"/>
-          <w:iCs w:val="false"/>
-          <w:strike w:val="false"/>
-          <w:color w:val="000000"/>
+          <w:rFonts w:ascii="Calibri" w:cs="Calibri" w:eastAsia="Calibri" w:hAnsi="Calibri"/>
+          <w:b w:val="false"/>
+          <w:bCs w:val="false"/>
+          <w:i w:val="false"/>
+          <w:iCs w:val="false"/>
+          <w:strike w:val="false"/>
+          <w:color w:val="000000"/>
+          <w:sz w:val="24"/>
+          <w:szCs w:val="24"/>
         </w:rPr>
         <w:t xml:space="preserve">和</w:t>
       </w:r>
       <w:r>
         <w:rPr>
+          <w:rFonts w:ascii="Calibri" w:cs="Calibri" w:eastAsia="Calibri" w:hAnsi="Calibri"/>
           <w:b w:val="false"/>
           <w:bCs w:val="false"/>
           <w:i/>
           <w:iCs/>
           <w:strike w:val="false"/>
           <w:color w:val="000000"/>
+          <w:sz w:val="24"/>
+          <w:szCs w:val="24"/>
         </w:rPr>
         <w:t xml:space="preserve">斜体</w:t>
       </w:r>
       <w:r>
         <w:rPr>
-          <w:b w:val="false"/>
-          <w:bCs w:val="false"/>
-          <w:i w:val="false"/>
-          <w:iCs w:val="false"/>
-          <w:strike w:val="false"/>
-          <w:color w:val="000000"/>
+          <w:rFonts w:ascii="Calibri" w:cs="Calibri" w:eastAsia="Calibri" w:hAnsi="Calibri"/>
+          <w:b w:val="false"/>
+          <w:bCs w:val="false"/>
+          <w:i w:val="false"/>
+          <w:iCs w:val="false"/>
+          <w:strike w:val="false"/>
+          <w:color w:val="000000"/>
+          <w:sz w:val="24"/>
+          <w:szCs w:val="24"/>
         </w:rPr>
         <w:t xml:space="preserve">。</w:t>
       </w:r>
@@ -594,12 +706,15 @@
       </w:pPr>
       <w:r>
         <w:rPr>
-          <w:b w:val="false"/>
-          <w:bCs w:val="false"/>
-          <w:i w:val="false"/>
-          <w:iCs w:val="false"/>
-          <w:strike w:val="false"/>
-          <w:color w:val="000000"/>
+          <w:rFonts w:ascii="Calibri" w:cs="Calibri" w:eastAsia="Calibri" w:hAnsi="Calibri"/>
+          <w:b w:val="false"/>
+          <w:bCs w:val="false"/>
+          <w:i w:val="false"/>
+          <w:iCs w:val="false"/>
+          <w:strike w:val="false"/>
+          <w:color w:val="000000"/>
+          <w:sz w:val="24"/>
+          <w:szCs w:val="24"/>
         </w:rPr>
         <w:t xml:space="preserve">这是另一个引用块。</w:t>
       </w:r>
@@ -615,12 +730,15 @@
       </w:pPr>
       <w:r>
         <w:rPr>
-          <w:b w:val="false"/>
-          <w:bCs w:val="false"/>
-          <w:i w:val="false"/>
-          <w:iCs w:val="false"/>
-          <w:strike w:val="false"/>
-          <w:color w:val="000000"/>
+          <w:rFonts w:ascii="Calibri" w:cs="Calibri" w:eastAsia="Calibri" w:hAnsi="Calibri"/>
+          <w:b w:val="false"/>
+          <w:bCs w:val="false"/>
+          <w:i w:val="false"/>
+          <w:iCs w:val="false"/>
+          <w:strike w:val="false"/>
+          <w:color w:val="000000"/>
+          <w:sz w:val="24"/>
+          <w:szCs w:val="24"/>
         </w:rPr>
         <w:t xml:space="preserve">这是嵌套引用（二级）。</w:t>
       </w:r>
@@ -636,12 +754,15 @@
       </w:pPr>
       <w:r>
         <w:rPr>
-          <w:b w:val="false"/>
-          <w:bCs w:val="false"/>
-          <w:i w:val="false"/>
-          <w:iCs w:val="false"/>
-          <w:strike w:val="false"/>
-          <w:color w:val="000000"/>
+          <w:rFonts w:ascii="Calibri" w:cs="Calibri" w:eastAsia="Calibri" w:hAnsi="Calibri"/>
+          <w:b w:val="false"/>
+          <w:bCs w:val="false"/>
+          <w:i w:val="false"/>
+          <w:iCs w:val="false"/>
+          <w:strike w:val="false"/>
+          <w:color w:val="000000"/>
+          <w:sz w:val="24"/>
+          <w:szCs w:val="24"/>
         </w:rPr>
         <w:t xml:space="preserve">这是三级嵌套引用。</w:t>
       </w:r>
@@ -661,6 +782,7 @@
       </w:pPr>
       <w:r>
         <w:rPr>
+          <w:rFonts w:ascii="Calibri" w:cs="Calibri" w:eastAsia="Calibri" w:hAnsi="Calibri"/>
           <w:b/>
           <w:bCs/>
           <w:color w:val="000000"/>
@@ -677,18 +799,24 @@
       </w:pPr>
       <w:r>
         <w:rPr>
-          <w:color w:val="000000"/>
+          <w:rFonts w:ascii="Calibri" w:cs="Calibri" w:eastAsia="Calibri" w:hAnsi="Calibri"/>
+          <w:color w:val="000000"/>
+          <w:sz w:val="24"/>
+          <w:szCs w:val="24"/>
         </w:rPr>
         <w:t xml:space="preserve">1. </w:t>
       </w:r>
       <w:r>
         <w:rPr>
-          <w:b w:val="false"/>
-          <w:bCs w:val="false"/>
-          <w:i w:val="false"/>
-          <w:iCs w:val="false"/>
-          <w:strike w:val="false"/>
-          <w:color w:val="000000"/>
+          <w:rFonts w:ascii="Calibri" w:cs="Calibri" w:eastAsia="Calibri" w:hAnsi="Calibri"/>
+          <w:b w:val="false"/>
+          <w:bCs w:val="false"/>
+          <w:i w:val="false"/>
+          <w:iCs w:val="false"/>
+          <w:strike w:val="false"/>
+          <w:color w:val="000000"/>
+          <w:sz w:val="24"/>
+          <w:szCs w:val="24"/>
         </w:rPr>
         <w:t xml:space="preserve">第一项</w:t>
       </w:r>
@@ -700,18 +828,24 @@
       </w:pPr>
       <w:r>
         <w:rPr>
-          <w:color w:val="000000"/>
+          <w:rFonts w:ascii="Calibri" w:cs="Calibri" w:eastAsia="Calibri" w:hAnsi="Calibri"/>
+          <w:color w:val="000000"/>
+          <w:sz w:val="24"/>
+          <w:szCs w:val="24"/>
         </w:rPr>
         <w:t xml:space="preserve">2. </w:t>
       </w:r>
       <w:r>
         <w:rPr>
-          <w:b w:val="false"/>
-          <w:bCs w:val="false"/>
-          <w:i w:val="false"/>
-          <w:iCs w:val="false"/>
-          <w:strike w:val="false"/>
-          <w:color w:val="000000"/>
+          <w:rFonts w:ascii="Calibri" w:cs="Calibri" w:eastAsia="Calibri" w:hAnsi="Calibri"/>
+          <w:b w:val="false"/>
+          <w:bCs w:val="false"/>
+          <w:i w:val="false"/>
+          <w:iCs w:val="false"/>
+          <w:strike w:val="false"/>
+          <w:color w:val="000000"/>
+          <w:sz w:val="24"/>
+          <w:szCs w:val="24"/>
         </w:rPr>
         <w:t xml:space="preserve">第二项</w:t>
       </w:r>
@@ -723,18 +857,24 @@
       </w:pPr>
       <w:r>
         <w:rPr>
-          <w:color w:val="000000"/>
+          <w:rFonts w:ascii="Calibri" w:cs="Calibri" w:eastAsia="Calibri" w:hAnsi="Calibri"/>
+          <w:color w:val="000000"/>
+          <w:sz w:val="24"/>
+          <w:szCs w:val="24"/>
         </w:rPr>
         <w:t xml:space="preserve">3. </w:t>
       </w:r>
       <w:r>
         <w:rPr>
-          <w:b w:val="false"/>
-          <w:bCs w:val="false"/>
-          <w:i w:val="false"/>
-          <w:iCs w:val="false"/>
-          <w:strike w:val="false"/>
-          <w:color w:val="000000"/>
+          <w:rFonts w:ascii="Calibri" w:cs="Calibri" w:eastAsia="Calibri" w:hAnsi="Calibri"/>
+          <w:b w:val="false"/>
+          <w:bCs w:val="false"/>
+          <w:i w:val="false"/>
+          <w:iCs w:val="false"/>
+          <w:strike w:val="false"/>
+          <w:color w:val="000000"/>
+          <w:sz w:val="24"/>
+          <w:szCs w:val="24"/>
         </w:rPr>
         <w:t xml:space="preserve">第三项</w:t>
       </w:r>
@@ -746,18 +886,24 @@
       </w:pPr>
       <w:r>
         <w:rPr>
-          <w:color w:val="000000"/>
+          <w:rFonts w:ascii="Calibri" w:cs="Calibri" w:eastAsia="Calibri" w:hAnsi="Calibri"/>
+          <w:color w:val="000000"/>
+          <w:sz w:val="24"/>
+          <w:szCs w:val="24"/>
         </w:rPr>
         <w:t xml:space="preserve">4. </w:t>
       </w:r>
       <w:r>
         <w:rPr>
-          <w:b w:val="false"/>
-          <w:bCs w:val="false"/>
-          <w:i w:val="false"/>
-          <w:iCs w:val="false"/>
-          <w:strike w:val="false"/>
-          <w:color w:val="000000"/>
+          <w:rFonts w:ascii="Calibri" w:cs="Calibri" w:eastAsia="Calibri" w:hAnsi="Calibri"/>
+          <w:b w:val="false"/>
+          <w:bCs w:val="false"/>
+          <w:i w:val="false"/>
+          <w:iCs w:val="false"/>
+          <w:strike w:val="false"/>
+          <w:color w:val="000000"/>
+          <w:sz w:val="24"/>
+          <w:szCs w:val="24"/>
         </w:rPr>
         <w:t xml:space="preserve">第四项</w:t>
       </w:r>
@@ -769,18 +915,24 @@
       </w:pPr>
       <w:r>
         <w:rPr>
-          <w:color w:val="000000"/>
+          <w:rFonts w:ascii="Calibri" w:cs="Calibri" w:eastAsia="Calibri" w:hAnsi="Calibri"/>
+          <w:color w:val="000000"/>
+          <w:sz w:val="24"/>
+          <w:szCs w:val="24"/>
         </w:rPr>
         <w:t xml:space="preserve">5. </w:t>
       </w:r>
       <w:r>
         <w:rPr>
-          <w:b w:val="false"/>
-          <w:bCs w:val="false"/>
-          <w:i w:val="false"/>
-          <w:iCs w:val="false"/>
-          <w:strike w:val="false"/>
-          <w:color w:val="000000"/>
+          <w:rFonts w:ascii="Calibri" w:cs="Calibri" w:eastAsia="Calibri" w:hAnsi="Calibri"/>
+          <w:b w:val="false"/>
+          <w:bCs w:val="false"/>
+          <w:i w:val="false"/>
+          <w:iCs w:val="false"/>
+          <w:strike w:val="false"/>
+          <w:color w:val="000000"/>
+          <w:sz w:val="24"/>
+          <w:szCs w:val="24"/>
         </w:rPr>
         <w:t xml:space="preserve">第五项</w:t>
       </w:r>
@@ -800,6 +952,7 @@
       </w:pPr>
       <w:r>
         <w:rPr>
+          <w:rFonts w:ascii="Calibri" w:cs="Calibri" w:eastAsia="Calibri" w:hAnsi="Calibri"/>
           <w:b/>
           <w:bCs/>
           <w:color w:val="000000"/>
@@ -820,12 +973,15 @@
       </w:pPr>
       <w:r>
         <w:rPr>
-          <w:b w:val="false"/>
-          <w:bCs w:val="false"/>
-          <w:i w:val="false"/>
-          <w:iCs w:val="false"/>
-          <w:strike w:val="false"/>
-          <w:color w:val="000000"/>
+          <w:rFonts w:ascii="Calibri" w:cs="Calibri" w:eastAsia="Calibri" w:hAnsi="Calibri"/>
+          <w:b w:val="false"/>
+          <w:bCs w:val="false"/>
+          <w:i w:val="false"/>
+          <w:iCs w:val="false"/>
+          <w:strike w:val="false"/>
+          <w:color w:val="000000"/>
+          <w:sz w:val="24"/>
+          <w:szCs w:val="24"/>
         </w:rPr>
         <w:t xml:space="preserve">项目 A</w:t>
       </w:r>
@@ -841,12 +997,15 @@
       </w:pPr>
       <w:r>
         <w:rPr>
-          <w:b w:val="false"/>
-          <w:bCs w:val="false"/>
-          <w:i w:val="false"/>
-          <w:iCs w:val="false"/>
-          <w:strike w:val="false"/>
-          <w:color w:val="000000"/>
+          <w:rFonts w:ascii="Calibri" w:cs="Calibri" w:eastAsia="Calibri" w:hAnsi="Calibri"/>
+          <w:b w:val="false"/>
+          <w:bCs w:val="false"/>
+          <w:i w:val="false"/>
+          <w:iCs w:val="false"/>
+          <w:strike w:val="false"/>
+          <w:color w:val="000000"/>
+          <w:sz w:val="24"/>
+          <w:szCs w:val="24"/>
         </w:rPr>
         <w:t xml:space="preserve">项目 B</w:t>
       </w:r>
@@ -862,12 +1021,15 @@
       </w:pPr>
       <w:r>
         <w:rPr>
-          <w:b w:val="false"/>
-          <w:bCs w:val="false"/>
-          <w:i w:val="false"/>
-          <w:iCs w:val="false"/>
-          <w:strike w:val="false"/>
-          <w:color w:val="000000"/>
+          <w:rFonts w:ascii="Calibri" w:cs="Calibri" w:eastAsia="Calibri" w:hAnsi="Calibri"/>
+          <w:b w:val="false"/>
+          <w:bCs w:val="false"/>
+          <w:i w:val="false"/>
+          <w:iCs w:val="false"/>
+          <w:strike w:val="false"/>
+          <w:color w:val="000000"/>
+          <w:sz w:val="24"/>
+          <w:szCs w:val="24"/>
         </w:rPr>
         <w:t xml:space="preserve">项目 C</w:t>
       </w:r>
@@ -887,6 +1049,7 @@
       </w:pPr>
       <w:r>
         <w:rPr>
+          <w:rFonts w:ascii="Calibri" w:cs="Calibri" w:eastAsia="Calibri" w:hAnsi="Calibri"/>
           <w:b/>
           <w:bCs/>
           <w:color w:val="000000"/>
@@ -903,6 +1066,7 @@
       </w:pPr>
       <w:r>
         <w:rPr>
+          <w:rFonts w:ascii="Calibri" w:cs="Calibri" w:eastAsia="Calibri" w:hAnsi="Calibri"/>
           <w:b/>
           <w:bCs/>
           <w:color w:val="000000"/>
@@ -923,12 +1087,15 @@
       </w:pPr>
       <w:r>
         <w:rPr>
-          <w:b w:val="false"/>
-          <w:bCs w:val="false"/>
-          <w:i w:val="false"/>
-          <w:iCs w:val="false"/>
-          <w:strike w:val="false"/>
-          <w:color w:val="000000"/>
+          <w:rFonts w:ascii="Calibri" w:cs="Calibri" w:eastAsia="Calibri" w:hAnsi="Calibri"/>
+          <w:b w:val="false"/>
+          <w:bCs w:val="false"/>
+          <w:i w:val="false"/>
+          <w:iCs w:val="false"/>
+          <w:strike w:val="false"/>
+          <w:color w:val="000000"/>
+          <w:sz w:val="24"/>
+          <w:szCs w:val="24"/>
         </w:rPr>
         <w:t xml:space="preserve">一级项目 1</w:t>
       </w:r>
@@ -944,12 +1111,15 @@
       </w:pPr>
       <w:r>
         <w:rPr>
-          <w:b w:val="false"/>
-          <w:bCs w:val="false"/>
-          <w:i w:val="false"/>
-          <w:iCs w:val="false"/>
-          <w:strike w:val="false"/>
-          <w:color w:val="000000"/>
+          <w:rFonts w:ascii="Calibri" w:cs="Calibri" w:eastAsia="Calibri" w:hAnsi="Calibri"/>
+          <w:b w:val="false"/>
+          <w:bCs w:val="false"/>
+          <w:i w:val="false"/>
+          <w:iCs w:val="false"/>
+          <w:strike w:val="false"/>
+          <w:color w:val="000000"/>
+          <w:sz w:val="24"/>
+          <w:szCs w:val="24"/>
         </w:rPr>
         <w:t xml:space="preserve">二级项目 1.1</w:t>
       </w:r>
@@ -965,12 +1135,15 @@
       </w:pPr>
       <w:r>
         <w:rPr>
-          <w:b w:val="false"/>
-          <w:bCs w:val="false"/>
-          <w:i w:val="false"/>
-          <w:iCs w:val="false"/>
-          <w:strike w:val="false"/>
-          <w:color w:val="000000"/>
+          <w:rFonts w:ascii="Calibri" w:cs="Calibri" w:eastAsia="Calibri" w:hAnsi="Calibri"/>
+          <w:b w:val="false"/>
+          <w:bCs w:val="false"/>
+          <w:i w:val="false"/>
+          <w:iCs w:val="false"/>
+          <w:strike w:val="false"/>
+          <w:color w:val="000000"/>
+          <w:sz w:val="24"/>
+          <w:szCs w:val="24"/>
         </w:rPr>
         <w:t xml:space="preserve">二级项目 1.2</w:t>
       </w:r>
@@ -986,12 +1159,15 @@
       </w:pPr>
       <w:r>
         <w:rPr>
-          <w:b w:val="false"/>
-          <w:bCs w:val="false"/>
-          <w:i w:val="false"/>
-          <w:iCs w:val="false"/>
-          <w:strike w:val="false"/>
-          <w:color w:val="000000"/>
+          <w:rFonts w:ascii="Calibri" w:cs="Calibri" w:eastAsia="Calibri" w:hAnsi="Calibri"/>
+          <w:b w:val="false"/>
+          <w:bCs w:val="false"/>
+          <w:i w:val="false"/>
+          <w:iCs w:val="false"/>
+          <w:strike w:val="false"/>
+          <w:color w:val="000000"/>
+          <w:sz w:val="24"/>
+          <w:szCs w:val="24"/>
         </w:rPr>
         <w:t xml:space="preserve">三级项目 1.2.1</w:t>
       </w:r>
@@ -1007,12 +1183,15 @@
       </w:pPr>
       <w:r>
         <w:rPr>
-          <w:b w:val="false"/>
-          <w:bCs w:val="false"/>
-          <w:i w:val="false"/>
-          <w:iCs w:val="false"/>
-          <w:strike w:val="false"/>
-          <w:color w:val="000000"/>
+          <w:rFonts w:ascii="Calibri" w:cs="Calibri" w:eastAsia="Calibri" w:hAnsi="Calibri"/>
+          <w:b w:val="false"/>
+          <w:bCs w:val="false"/>
+          <w:i w:val="false"/>
+          <w:iCs w:val="false"/>
+          <w:strike w:val="false"/>
+          <w:color w:val="000000"/>
+          <w:sz w:val="24"/>
+          <w:szCs w:val="24"/>
         </w:rPr>
         <w:t xml:space="preserve">三级项目 1.2.2</w:t>
       </w:r>
@@ -1028,12 +1207,15 @@
       </w:pPr>
       <w:r>
         <w:rPr>
-          <w:b w:val="false"/>
-          <w:bCs w:val="false"/>
-          <w:i w:val="false"/>
-          <w:iCs w:val="false"/>
-          <w:strike w:val="false"/>
-          <w:color w:val="000000"/>
+          <w:rFonts w:ascii="Calibri" w:cs="Calibri" w:eastAsia="Calibri" w:hAnsi="Calibri"/>
+          <w:b w:val="false"/>
+          <w:bCs w:val="false"/>
+          <w:i w:val="false"/>
+          <w:iCs w:val="false"/>
+          <w:strike w:val="false"/>
+          <w:color w:val="000000"/>
+          <w:sz w:val="24"/>
+          <w:szCs w:val="24"/>
         </w:rPr>
         <w:t xml:space="preserve">一级项目 2</w:t>
       </w:r>
@@ -1049,12 +1231,15 @@
       </w:pPr>
       <w:r>
         <w:rPr>
-          <w:b w:val="false"/>
-          <w:bCs w:val="false"/>
-          <w:i w:val="false"/>
-          <w:iCs w:val="false"/>
-          <w:strike w:val="false"/>
-          <w:color w:val="000000"/>
+          <w:rFonts w:ascii="Calibri" w:cs="Calibri" w:eastAsia="Calibri" w:hAnsi="Calibri"/>
+          <w:b w:val="false"/>
+          <w:bCs w:val="false"/>
+          <w:i w:val="false"/>
+          <w:iCs w:val="false"/>
+          <w:strike w:val="false"/>
+          <w:color w:val="000000"/>
+          <w:sz w:val="24"/>
+          <w:szCs w:val="24"/>
         </w:rPr>
         <w:t xml:space="preserve">二级项目 2.1</w:t>
       </w:r>
@@ -1066,6 +1251,7 @@
       </w:pPr>
       <w:r>
         <w:rPr>
+          <w:rFonts w:ascii="Calibri" w:cs="Calibri" w:eastAsia="Calibri" w:hAnsi="Calibri"/>
           <w:b/>
           <w:bCs/>
           <w:color w:val="000000"/>
@@ -1082,18 +1268,24 @@
       </w:pPr>
       <w:r>
         <w:rPr>
-          <w:color w:val="000000"/>
+          <w:rFonts w:ascii="Calibri" w:cs="Calibri" w:eastAsia="Calibri" w:hAnsi="Calibri"/>
+          <w:color w:val="000000"/>
+          <w:sz w:val="24"/>
+          <w:szCs w:val="24"/>
         </w:rPr>
         <w:t xml:space="preserve">1. </w:t>
       </w:r>
       <w:r>
         <w:rPr>
-          <w:b w:val="false"/>
-          <w:bCs w:val="false"/>
-          <w:i w:val="false"/>
-          <w:iCs w:val="false"/>
-          <w:strike w:val="false"/>
-          <w:color w:val="000000"/>
+          <w:rFonts w:ascii="Calibri" w:cs="Calibri" w:eastAsia="Calibri" w:hAnsi="Calibri"/>
+          <w:b w:val="false"/>
+          <w:bCs w:val="false"/>
+          <w:i w:val="false"/>
+          <w:iCs w:val="false"/>
+          <w:strike w:val="false"/>
+          <w:color w:val="000000"/>
+          <w:sz w:val="24"/>
+          <w:szCs w:val="24"/>
         </w:rPr>
         <w:t xml:space="preserve">第一章</w:t>
       </w:r>
@@ -1105,18 +1297,24 @@
       </w:pPr>
       <w:r>
         <w:rPr>
-          <w:color w:val="000000"/>
+          <w:rFonts w:ascii="Calibri" w:cs="Calibri" w:eastAsia="Calibri" w:hAnsi="Calibri"/>
+          <w:color w:val="000000"/>
+          <w:sz w:val="24"/>
+          <w:szCs w:val="24"/>
         </w:rPr>
         <w:t xml:space="preserve">1. </w:t>
       </w:r>
       <w:r>
         <w:rPr>
-          <w:b w:val="false"/>
-          <w:bCs w:val="false"/>
-          <w:i w:val="false"/>
-          <w:iCs w:val="false"/>
-          <w:strike w:val="false"/>
-          <w:color w:val="000000"/>
+          <w:rFonts w:ascii="Calibri" w:cs="Calibri" w:eastAsia="Calibri" w:hAnsi="Calibri"/>
+          <w:b w:val="false"/>
+          <w:bCs w:val="false"/>
+          <w:i w:val="false"/>
+          <w:iCs w:val="false"/>
+          <w:strike w:val="false"/>
+          <w:color w:val="000000"/>
+          <w:sz w:val="24"/>
+          <w:szCs w:val="24"/>
         </w:rPr>
         <w:t xml:space="preserve">第一节</w:t>
       </w:r>
@@ -1128,18 +1326,24 @@
       </w:pPr>
       <w:r>
         <w:rPr>
-          <w:color w:val="000000"/>
+          <w:rFonts w:ascii="Calibri" w:cs="Calibri" w:eastAsia="Calibri" w:hAnsi="Calibri"/>
+          <w:color w:val="000000"/>
+          <w:sz w:val="24"/>
+          <w:szCs w:val="24"/>
         </w:rPr>
         <w:t xml:space="preserve">2. </w:t>
       </w:r>
       <w:r>
         <w:rPr>
-          <w:b w:val="false"/>
-          <w:bCs w:val="false"/>
-          <w:i w:val="false"/>
-          <w:iCs w:val="false"/>
-          <w:strike w:val="false"/>
-          <w:color w:val="000000"/>
+          <w:rFonts w:ascii="Calibri" w:cs="Calibri" w:eastAsia="Calibri" w:hAnsi="Calibri"/>
+          <w:b w:val="false"/>
+          <w:bCs w:val="false"/>
+          <w:i w:val="false"/>
+          <w:iCs w:val="false"/>
+          <w:strike w:val="false"/>
+          <w:color w:val="000000"/>
+          <w:sz w:val="24"/>
+          <w:szCs w:val="24"/>
         </w:rPr>
         <w:t xml:space="preserve">第二节</w:t>
       </w:r>
@@ -1151,18 +1355,24 @@
       </w:pPr>
       <w:r>
         <w:rPr>
-          <w:color w:val="000000"/>
+          <w:rFonts w:ascii="Calibri" w:cs="Calibri" w:eastAsia="Calibri" w:hAnsi="Calibri"/>
+          <w:color w:val="000000"/>
+          <w:sz w:val="24"/>
+          <w:szCs w:val="24"/>
         </w:rPr>
         <w:t xml:space="preserve">1. </w:t>
       </w:r>
       <w:r>
         <w:rPr>
-          <w:b w:val="false"/>
-          <w:bCs w:val="false"/>
-          <w:i w:val="false"/>
-          <w:iCs w:val="false"/>
-          <w:strike w:val="false"/>
-          <w:color w:val="000000"/>
+          <w:rFonts w:ascii="Calibri" w:cs="Calibri" w:eastAsia="Calibri" w:hAnsi="Calibri"/>
+          <w:b w:val="false"/>
+          <w:bCs w:val="false"/>
+          <w:i w:val="false"/>
+          <w:iCs w:val="false"/>
+          <w:strike w:val="false"/>
+          <w:color w:val="000000"/>
+          <w:sz w:val="24"/>
+          <w:szCs w:val="24"/>
         </w:rPr>
         <w:t xml:space="preserve">第一小节</w:t>
       </w:r>
@@ -1174,18 +1384,24 @@
       </w:pPr>
       <w:r>
         <w:rPr>
-          <w:color w:val="000000"/>
+          <w:rFonts w:ascii="Calibri" w:cs="Calibri" w:eastAsia="Calibri" w:hAnsi="Calibri"/>
+          <w:color w:val="000000"/>
+          <w:sz w:val="24"/>
+          <w:szCs w:val="24"/>
         </w:rPr>
         <w:t xml:space="preserve">2. </w:t>
       </w:r>
       <w:r>
         <w:rPr>
-          <w:b w:val="false"/>
-          <w:bCs w:val="false"/>
-          <w:i w:val="false"/>
-          <w:iCs w:val="false"/>
-          <w:strike w:val="false"/>
-          <w:color w:val="000000"/>
+          <w:rFonts w:ascii="Calibri" w:cs="Calibri" w:eastAsia="Calibri" w:hAnsi="Calibri"/>
+          <w:b w:val="false"/>
+          <w:bCs w:val="false"/>
+          <w:i w:val="false"/>
+          <w:iCs w:val="false"/>
+          <w:strike w:val="false"/>
+          <w:color w:val="000000"/>
+          <w:sz w:val="24"/>
+          <w:szCs w:val="24"/>
         </w:rPr>
         <w:t xml:space="preserve">第二小节</w:t>
       </w:r>
@@ -1197,18 +1413,24 @@
       </w:pPr>
       <w:r>
         <w:rPr>
-          <w:color w:val="000000"/>
+          <w:rFonts w:ascii="Calibri" w:cs="Calibri" w:eastAsia="Calibri" w:hAnsi="Calibri"/>
+          <w:color w:val="000000"/>
+          <w:sz w:val="24"/>
+          <w:szCs w:val="24"/>
         </w:rPr>
         <w:t xml:space="preserve">2. </w:t>
       </w:r>
       <w:r>
         <w:rPr>
-          <w:b w:val="false"/>
-          <w:bCs w:val="false"/>
-          <w:i w:val="false"/>
-          <w:iCs w:val="false"/>
-          <w:strike w:val="false"/>
-          <w:color w:val="000000"/>
+          <w:rFonts w:ascii="Calibri" w:cs="Calibri" w:eastAsia="Calibri" w:hAnsi="Calibri"/>
+          <w:b w:val="false"/>
+          <w:bCs w:val="false"/>
+          <w:i w:val="false"/>
+          <w:iCs w:val="false"/>
+          <w:strike w:val="false"/>
+          <w:color w:val="000000"/>
+          <w:sz w:val="24"/>
+          <w:szCs w:val="24"/>
         </w:rPr>
         <w:t xml:space="preserve">第二章</w:t>
       </w:r>
@@ -1220,18 +1442,24 @@
       </w:pPr>
       <w:r>
         <w:rPr>
-          <w:color w:val="000000"/>
+          <w:rFonts w:ascii="Calibri" w:cs="Calibri" w:eastAsia="Calibri" w:hAnsi="Calibri"/>
+          <w:color w:val="000000"/>
+          <w:sz w:val="24"/>
+          <w:szCs w:val="24"/>
         </w:rPr>
         <w:t xml:space="preserve">1. </w:t>
       </w:r>
       <w:r>
         <w:rPr>
-          <w:b w:val="false"/>
-          <w:bCs w:val="false"/>
-          <w:i w:val="false"/>
-          <w:iCs w:val="false"/>
-          <w:strike w:val="false"/>
-          <w:color w:val="000000"/>
+          <w:rFonts w:ascii="Calibri" w:cs="Calibri" w:eastAsia="Calibri" w:hAnsi="Calibri"/>
+          <w:b w:val="false"/>
+          <w:bCs w:val="false"/>
+          <w:i w:val="false"/>
+          <w:iCs w:val="false"/>
+          <w:strike w:val="false"/>
+          <w:color w:val="000000"/>
+          <w:sz w:val="24"/>
+          <w:szCs w:val="24"/>
         </w:rPr>
         <w:t xml:space="preserve">第一节</w:t>
       </w:r>
@@ -1243,6 +1471,7 @@
       </w:pPr>
       <w:r>
         <w:rPr>
+          <w:rFonts w:ascii="Calibri" w:cs="Calibri" w:eastAsia="Calibri" w:hAnsi="Calibri"/>
           <w:b/>
           <w:bCs/>
           <w:color w:val="000000"/>
@@ -1259,18 +1488,24 @@
       </w:pPr>
       <w:r>
         <w:rPr>
-          <w:color w:val="000000"/>
+          <w:rFonts w:ascii="Calibri" w:cs="Calibri" w:eastAsia="Calibri" w:hAnsi="Calibri"/>
+          <w:color w:val="000000"/>
+          <w:sz w:val="24"/>
+          <w:szCs w:val="24"/>
         </w:rPr>
         <w:t xml:space="preserve">1. </w:t>
       </w:r>
       <w:r>
         <w:rPr>
-          <w:b w:val="false"/>
-          <w:bCs w:val="false"/>
-          <w:i w:val="false"/>
-          <w:iCs w:val="false"/>
-          <w:strike w:val="false"/>
-          <w:color w:val="000000"/>
+          <w:rFonts w:ascii="Calibri" w:cs="Calibri" w:eastAsia="Calibri" w:hAnsi="Calibri"/>
+          <w:b w:val="false"/>
+          <w:bCs w:val="false"/>
+          <w:i w:val="false"/>
+          <w:iCs w:val="false"/>
+          <w:strike w:val="false"/>
+          <w:color w:val="000000"/>
+          <w:sz w:val="24"/>
+          <w:szCs w:val="24"/>
         </w:rPr>
         <w:t xml:space="preserve">有序项目 1</w:t>
       </w:r>
@@ -1286,12 +1521,15 @@
       </w:pPr>
       <w:r>
         <w:rPr>
-          <w:b w:val="false"/>
-          <w:bCs w:val="false"/>
-          <w:i w:val="false"/>
-          <w:iCs w:val="false"/>
-          <w:strike w:val="false"/>
-          <w:color w:val="000000"/>
+          <w:rFonts w:ascii="Calibri" w:cs="Calibri" w:eastAsia="Calibri" w:hAnsi="Calibri"/>
+          <w:b w:val="false"/>
+          <w:bCs w:val="false"/>
+          <w:i w:val="false"/>
+          <w:iCs w:val="false"/>
+          <w:strike w:val="false"/>
+          <w:color w:val="000000"/>
+          <w:sz w:val="24"/>
+          <w:szCs w:val="24"/>
         </w:rPr>
         <w:t xml:space="preserve">无序子项 A</w:t>
       </w:r>
@@ -1307,12 +1545,15 @@
       </w:pPr>
       <w:r>
         <w:rPr>
-          <w:b w:val="false"/>
-          <w:bCs w:val="false"/>
-          <w:i w:val="false"/>
-          <w:iCs w:val="false"/>
-          <w:strike w:val="false"/>
-          <w:color w:val="000000"/>
+          <w:rFonts w:ascii="Calibri" w:cs="Calibri" w:eastAsia="Calibri" w:hAnsi="Calibri"/>
+          <w:b w:val="false"/>
+          <w:bCs w:val="false"/>
+          <w:i w:val="false"/>
+          <w:iCs w:val="false"/>
+          <w:strike w:val="false"/>
+          <w:color w:val="000000"/>
+          <w:sz w:val="24"/>
+          <w:szCs w:val="24"/>
         </w:rPr>
         <w:t xml:space="preserve">无序子项 B</w:t>
       </w:r>
@@ -1324,18 +1565,24 @@
       </w:pPr>
       <w:r>
         <w:rPr>
-          <w:color w:val="000000"/>
+          <w:rFonts w:ascii="Calibri" w:cs="Calibri" w:eastAsia="Calibri" w:hAnsi="Calibri"/>
+          <w:color w:val="000000"/>
+          <w:sz w:val="24"/>
+          <w:szCs w:val="24"/>
         </w:rPr>
         <w:t xml:space="preserve">2. </w:t>
       </w:r>
       <w:r>
         <w:rPr>
-          <w:b w:val="false"/>
-          <w:bCs w:val="false"/>
-          <w:i w:val="false"/>
-          <w:iCs w:val="false"/>
-          <w:strike w:val="false"/>
-          <w:color w:val="000000"/>
+          <w:rFonts w:ascii="Calibri" w:cs="Calibri" w:eastAsia="Calibri" w:hAnsi="Calibri"/>
+          <w:b w:val="false"/>
+          <w:bCs w:val="false"/>
+          <w:i w:val="false"/>
+          <w:iCs w:val="false"/>
+          <w:strike w:val="false"/>
+          <w:color w:val="000000"/>
+          <w:sz w:val="24"/>
+          <w:szCs w:val="24"/>
         </w:rPr>
         <w:t xml:space="preserve">有序项目 2</w:t>
       </w:r>
@@ -1351,12 +1598,15 @@
       </w:pPr>
       <w:r>
         <w:rPr>
-          <w:b w:val="false"/>
-          <w:bCs w:val="false"/>
-          <w:i w:val="false"/>
-          <w:iCs w:val="false"/>
-          <w:strike w:val="false"/>
-          <w:color w:val="000000"/>
+          <w:rFonts w:ascii="Calibri" w:cs="Calibri" w:eastAsia="Calibri" w:hAnsi="Calibri"/>
+          <w:b w:val="false"/>
+          <w:bCs w:val="false"/>
+          <w:i w:val="false"/>
+          <w:iCs w:val="false"/>
+          <w:strike w:val="false"/>
+          <w:color w:val="000000"/>
+          <w:sz w:val="24"/>
+          <w:szCs w:val="24"/>
         </w:rPr>
         <w:t xml:space="preserve">无序子项 C</w:t>
       </w:r>
@@ -1368,18 +1618,24 @@
       </w:pPr>
       <w:r>
         <w:rPr>
-          <w:color w:val="000000"/>
+          <w:rFonts w:ascii="Calibri" w:cs="Calibri" w:eastAsia="Calibri" w:hAnsi="Calibri"/>
+          <w:color w:val="000000"/>
+          <w:sz w:val="24"/>
+          <w:szCs w:val="24"/>
         </w:rPr>
         <w:t xml:space="preserve">1. </w:t>
       </w:r>
       <w:r>
         <w:rPr>
-          <w:b w:val="false"/>
-          <w:bCs w:val="false"/>
-          <w:i w:val="false"/>
-          <w:iCs w:val="false"/>
-          <w:strike w:val="false"/>
-          <w:color w:val="000000"/>
+          <w:rFonts w:ascii="Calibri" w:cs="Calibri" w:eastAsia="Calibri" w:hAnsi="Calibri"/>
+          <w:b w:val="false"/>
+          <w:bCs w:val="false"/>
+          <w:i w:val="false"/>
+          <w:iCs w:val="false"/>
+          <w:strike w:val="false"/>
+          <w:color w:val="000000"/>
+          <w:sz w:val="24"/>
+          <w:szCs w:val="24"/>
         </w:rPr>
         <w:t xml:space="preserve">嵌套有序 1</w:t>
       </w:r>
@@ -1391,18 +1647,24 @@
       </w:pPr>
       <w:r>
         <w:rPr>
-          <w:color w:val="000000"/>
+          <w:rFonts w:ascii="Calibri" w:cs="Calibri" w:eastAsia="Calibri" w:hAnsi="Calibri"/>
+          <w:color w:val="000000"/>
+          <w:sz w:val="24"/>
+          <w:szCs w:val="24"/>
         </w:rPr>
         <w:t xml:space="preserve">2. </w:t>
       </w:r>
       <w:r>
         <w:rPr>
-          <w:b w:val="false"/>
-          <w:bCs w:val="false"/>
-          <w:i w:val="false"/>
-          <w:iCs w:val="false"/>
-          <w:strike w:val="false"/>
-          <w:color w:val="000000"/>
+          <w:rFonts w:ascii="Calibri" w:cs="Calibri" w:eastAsia="Calibri" w:hAnsi="Calibri"/>
+          <w:b w:val="false"/>
+          <w:bCs w:val="false"/>
+          <w:i w:val="false"/>
+          <w:iCs w:val="false"/>
+          <w:strike w:val="false"/>
+          <w:color w:val="000000"/>
+          <w:sz w:val="24"/>
+          <w:szCs w:val="24"/>
         </w:rPr>
         <w:t xml:space="preserve">嵌套有序 2</w:t>
       </w:r>
@@ -1422,6 +1684,7 @@
       </w:pPr>
       <w:r>
         <w:rPr>
+          <w:rFonts w:ascii="Calibri" w:cs="Calibri" w:eastAsia="Calibri" w:hAnsi="Calibri"/>
           <w:b/>
           <w:bCs/>
           <w:color w:val="000000"/>
@@ -1442,12 +1705,15 @@
       </w:pPr>
       <w:r>
         <w:rPr>
-          <w:b w:val="false"/>
-          <w:bCs w:val="false"/>
-          <w:i w:val="false"/>
-          <w:iCs w:val="false"/>
-          <w:strike w:val="false"/>
-          <w:color w:val="000000"/>
+          <w:rFonts w:ascii="Calibri" w:cs="Calibri" w:eastAsia="Calibri" w:hAnsi="Calibri"/>
+          <w:b w:val="false"/>
+          <w:bCs w:val="false"/>
+          <w:i w:val="false"/>
+          <w:iCs w:val="false"/>
+          <w:strike w:val="false"/>
+          <w:color w:val="000000"/>
+          <w:sz w:val="24"/>
+          <w:szCs w:val="24"/>
         </w:rPr>
         <w:t xml:space="preserve"> 未完成任务</w:t>
       </w:r>
@@ -1463,12 +1729,15 @@
       </w:pPr>
       <w:r>
         <w:rPr>
-          <w:b w:val="false"/>
-          <w:bCs w:val="false"/>
-          <w:i w:val="false"/>
-          <w:iCs w:val="false"/>
-          <w:strike w:val="false"/>
-          <w:color w:val="000000"/>
+          <w:rFonts w:ascii="Calibri" w:cs="Calibri" w:eastAsia="Calibri" w:hAnsi="Calibri"/>
+          <w:b w:val="false"/>
+          <w:bCs w:val="false"/>
+          <w:i w:val="false"/>
+          <w:iCs w:val="false"/>
+          <w:strike w:val="false"/>
+          <w:color w:val="000000"/>
+          <w:sz w:val="24"/>
+          <w:szCs w:val="24"/>
         </w:rPr>
         <w:t xml:space="preserve"> 已完成任务</w:t>
       </w:r>
@@ -1484,12 +1753,15 @@
       </w:pPr>
       <w:r>
         <w:rPr>
-          <w:b w:val="false"/>
-          <w:bCs w:val="false"/>
-          <w:i w:val="false"/>
-          <w:iCs w:val="false"/>
-          <w:strike w:val="false"/>
-          <w:color w:val="000000"/>
+          <w:rFonts w:ascii="Calibri" w:cs="Calibri" w:eastAsia="Calibri" w:hAnsi="Calibri"/>
+          <w:b w:val="false"/>
+          <w:bCs w:val="false"/>
+          <w:i w:val="false"/>
+          <w:iCs w:val="false"/>
+          <w:strike w:val="false"/>
+          <w:color w:val="000000"/>
+          <w:sz w:val="24"/>
+          <w:szCs w:val="24"/>
         </w:rPr>
         <w:t xml:space="preserve"> 另一个未完成任务</w:t>
       </w:r>
@@ -1505,12 +1777,15 @@
       </w:pPr>
       <w:r>
         <w:rPr>
-          <w:b w:val="false"/>
-          <w:bCs w:val="false"/>
-          <w:i w:val="false"/>
-          <w:iCs w:val="false"/>
-          <w:strike w:val="false"/>
-          <w:color w:val="000000"/>
+          <w:rFonts w:ascii="Calibri" w:cs="Calibri" w:eastAsia="Calibri" w:hAnsi="Calibri"/>
+          <w:b w:val="false"/>
+          <w:bCs w:val="false"/>
+          <w:i w:val="false"/>
+          <w:iCs w:val="false"/>
+          <w:strike w:val="false"/>
+          <w:color w:val="000000"/>
+          <w:sz w:val="24"/>
+          <w:szCs w:val="24"/>
         </w:rPr>
         <w:t xml:space="preserve"> 另一个已完成任务</w:t>
       </w:r>
@@ -1530,6 +1805,7 @@
       </w:pPr>
       <w:r>
         <w:rPr>
+          <w:rFonts w:ascii="Calibri" w:cs="Calibri" w:eastAsia="Calibri" w:hAnsi="Calibri"/>
           <w:b/>
           <w:bCs/>
           <w:color w:val="000000"/>
@@ -1546,6 +1822,7 @@
       </w:pPr>
       <w:r>
         <w:rPr>
+          <w:rFonts w:ascii="Calibri" w:cs="Calibri" w:eastAsia="Calibri" w:hAnsi="Calibri"/>
           <w:b/>
           <w:bCs/>
           <w:color w:val="000000"/>
@@ -1557,16 +1834,19 @@
     </w:p>
     <w:p>
       <w:pPr>
-        <w:spacing w:before="0" w:after="0"/>
-      </w:pPr>
-      <w:r>
-        <w:rPr>
-          <w:b w:val="false"/>
-          <w:bCs w:val="false"/>
-          <w:i w:val="false"/>
-          <w:iCs w:val="false"/>
-          <w:strike w:val="false"/>
-          <w:color w:val="000000"/>
+        <w:spacing w:line="240" w:before="0" w:after="0"/>
+      </w:pPr>
+      <w:r>
+        <w:rPr>
+          <w:rFonts w:ascii="Calibri" w:cs="Calibri" w:eastAsia="Calibri" w:hAnsi="Calibri"/>
+          <w:b w:val="false"/>
+          <w:bCs w:val="false"/>
+          <w:i w:val="false"/>
+          <w:iCs w:val="false"/>
+          <w:strike w:val="false"/>
+          <w:color w:val="000000"/>
+          <w:sz w:val="24"/>
+          <w:szCs w:val="24"/>
         </w:rPr>
         <w:t xml:space="preserve">使用 </w:t>
       </w:r>
@@ -1574,18 +1854,23 @@
         <w:rPr>
           <w:rFonts w:ascii="Courier New" w:cs="Courier New" w:eastAsia="Courier New" w:hAnsi="Courier New"/>
           <w:color w:val="000000"/>
+          <w:sz w:val="24"/>
+          <w:szCs w:val="24"/>
           <w:shd w:fill="F2F2F2" w:color="auto" w:val="clear"/>
         </w:rPr>
         <w:t xml:space="preserve">console.log()</w:t>
       </w:r>
       <w:r>
         <w:rPr>
-          <w:b w:val="false"/>
-          <w:bCs w:val="false"/>
-          <w:i w:val="false"/>
-          <w:iCs w:val="false"/>
-          <w:strike w:val="false"/>
-          <w:color w:val="000000"/>
+          <w:rFonts w:ascii="Calibri" w:cs="Calibri" w:eastAsia="Calibri" w:hAnsi="Calibri"/>
+          <w:b w:val="false"/>
+          <w:bCs w:val="false"/>
+          <w:i w:val="false"/>
+          <w:iCs w:val="false"/>
+          <w:strike w:val="false"/>
+          <w:color w:val="000000"/>
+          <w:sz w:val="24"/>
+          <w:szCs w:val="24"/>
         </w:rPr>
         <w:t xml:space="preserve"> 打印输出，或者 </w:t>
       </w:r>
@@ -1593,18 +1878,23 @@
         <w:rPr>
           <w:rFonts w:ascii="Courier New" w:cs="Courier New" w:eastAsia="Courier New" w:hAnsi="Courier New"/>
           <w:color w:val="000000"/>
+          <w:sz w:val="24"/>
+          <w:szCs w:val="24"/>
           <w:shd w:fill="F2F2F2" w:color="auto" w:val="clear"/>
         </w:rPr>
         <w:t xml:space="preserve">npm install</w:t>
       </w:r>
       <w:r>
         <w:rPr>
-          <w:b w:val="false"/>
-          <w:bCs w:val="false"/>
-          <w:i w:val="false"/>
-          <w:iCs w:val="false"/>
-          <w:strike w:val="false"/>
-          <w:color w:val="000000"/>
+          <w:rFonts w:ascii="Calibri" w:cs="Calibri" w:eastAsia="Calibri" w:hAnsi="Calibri"/>
+          <w:b w:val="false"/>
+          <w:bCs w:val="false"/>
+          <w:i w:val="false"/>
+          <w:iCs w:val="false"/>
+          <w:strike w:val="false"/>
+          <w:color w:val="000000"/>
+          <w:sz w:val="24"/>
+          <w:szCs w:val="24"/>
         </w:rPr>
         <w:t xml:space="preserve"> 安装依赖。</w:t>
       </w:r>
@@ -1616,6 +1906,7 @@
       </w:pPr>
       <w:r>
         <w:rPr>
+          <w:rFonts w:ascii="Calibri" w:cs="Calibri" w:eastAsia="Calibri" w:hAnsi="Calibri"/>
           <w:b/>
           <w:bCs/>
           <w:color w:val="000000"/>
@@ -1627,23 +1918,96 @@
     </w:p>
     <w:p>
       <w:pPr>
-        <w:shd w:fill="F5F5F5" w:color="auto" w:val="clear"/>
-        <w:spacing w:before="100" w:after="100"/>
-      </w:pPr>
-      <w:r>
-        <w:rPr>
-          <w:rFonts w:ascii="Courier New" w:cs="Courier New" w:eastAsia="Courier New" w:hAnsi="Courier New"/>
-          <w:color w:val="333333"/>
-          <w:sz w:val="21"/>
-          <w:szCs w:val="21"/>
-        </w:rPr>
-        <w:t xml:space="preserve">function hello(name) {
-    console.log(`Hello, ${name}!`);
-}
-hello('World');
-</w:t>
-      </w:r>
-    </w:p>
+        <w:spacing w:before="0" w:after="40"/>
+      </w:pPr>
+    </w:p>
+    <w:tbl>
+      <w:tblPr>
+        <w:tblW w:type="dxa" w:w="9026"/>
+        <w:tblBorders>
+          <w:top w:val="single" w:color="DDDDDD" w:sz="6"/>
+          <w:left w:val="single" w:color="DDDDDD" w:sz="6"/>
+          <w:bottom w:val="single" w:color="DDDDDD" w:sz="6"/>
+          <w:right w:val="single" w:color="DDDDDD" w:sz="6"/>
+          <w:insideH w:val="single" w:color="auto" w:sz="4"/>
+          <w:insideV w:val="single" w:color="auto" w:sz="4"/>
+        </w:tblBorders>
+        <w:tblLayout w:type="fixed"/>
+      </w:tblPr>
+      <w:tblGrid>
+        <w:gridCol w:w="9026"/>
+      </w:tblGrid>
+      <w:tr>
+        <w:tc>
+          <w:tcPr>
+            <w:tcW w:type="dxa" w:w="9026"/>
+            <w:shd w:fill="F5F5F5" w:color="auto" w:val="clear"/>
+            <w:tcMar>
+              <w:top w:type="dxa" w:w="80"/>
+              <w:left w:type="dxa" w:w="150"/>
+              <w:bottom w:type="dxa" w:w="80"/>
+              <w:right w:type="dxa" w:w="150"/>
+            </w:tcMar>
+          </w:tcPr>
+          <w:p>
+            <w:pPr>
+              <w:spacing w:line="240" w:before="0" w:after="0"/>
+            </w:pPr>
+            <w:r>
+              <w:rPr>
+                <w:rFonts w:ascii="Consolas" w:cs="Consolas" w:eastAsia="Consolas" w:hAnsi="Consolas"/>
+                <w:color w:val="2B2B2B"/>
+                <w:sz w:val="18"/>
+                <w:szCs w:val="18"/>
+              </w:rPr>
+              <w:t xml:space="preserve">function hello(name) {</w:t>
+            </w:r>
+          </w:p>
+          <w:p>
+            <w:pPr>
+              <w:spacing w:line="240" w:before="0" w:after="0"/>
+            </w:pPr>
+            <w:r>
+              <w:rPr>
+                <w:rFonts w:ascii="Consolas" w:cs="Consolas" w:eastAsia="Consolas" w:hAnsi="Consolas"/>
+                <w:color w:val="2B2B2B"/>
+                <w:sz w:val="18"/>
+                <w:szCs w:val="18"/>
+              </w:rPr>
+              <w:t xml:space="preserve">    console.log(`Hello, ${name}!`);</w:t>
+            </w:r>
+          </w:p>
+          <w:p>
+            <w:pPr>
+              <w:spacing w:line="240" w:before="0" w:after="0"/>
+            </w:pPr>
+            <w:r>
+              <w:rPr>
+                <w:rFonts w:ascii="Consolas" w:cs="Consolas" w:eastAsia="Consolas" w:hAnsi="Consolas"/>
+                <w:color w:val="2B2B2B"/>
+                <w:sz w:val="18"/>
+                <w:szCs w:val="18"/>
+              </w:rPr>
+              <w:t xml:space="preserve">}</w:t>
+            </w:r>
+          </w:p>
+          <w:p>
+            <w:pPr>
+              <w:spacing w:line="240" w:before="0" w:after="0"/>
+            </w:pPr>
+            <w:r>
+              <w:rPr>
+                <w:rFonts w:ascii="Consolas" w:cs="Consolas" w:eastAsia="Consolas" w:hAnsi="Consolas"/>
+                <w:color w:val="2B2B2B"/>
+                <w:sz w:val="18"/>
+                <w:szCs w:val="18"/>
+              </w:rPr>
+              <w:t xml:space="preserve">hello('World');</w:t>
+            </w:r>
+          </w:p>
+        </w:tc>
+      </w:tr>
+    </w:tbl>
     <w:p>
       <w:pPr>
         <w:pBdr>
@@ -1659,6 +2023,7 @@
       </w:pPr>
       <w:r>
         <w:rPr>
+          <w:rFonts w:ascii="Calibri" w:cs="Calibri" w:eastAsia="Calibri" w:hAnsi="Calibri"/>
           <w:b/>
           <w:bCs/>
           <w:color w:val="000000"/>
@@ -1668,9 +2033,14 @@
         <w:t xml:space="preserve">9. 表格</w:t>
       </w:r>
     </w:p>
+    <w:p>
+      <w:pPr>
+        <w:spacing w:before="0" w:after="40"/>
+      </w:pPr>
+    </w:p>
     <w:tbl>
       <w:tblPr>
-        <w:tblW w:type="pct" w:w="100%"/>
+        <w:tblW w:type="dxa" w:w="9026"/>
         <w:tblBorders>
           <w:top w:val="single" w:color="000000" w:sz="4"/>
           <w:left w:val="single" w:color="000000" w:sz="4"/>
@@ -1679,15 +2049,17 @@
           <w:insideH w:val="single" w:color="000000" w:sz="4"/>
           <w:insideV w:val="single" w:color="000000" w:sz="4"/>
         </w:tblBorders>
+        <w:tblLayout w:type="fixed"/>
       </w:tblPr>
       <w:tblGrid>
-        <w:gridCol w:w="100"/>
-        <w:gridCol w:w="100"/>
-        <w:gridCol w:w="100"/>
+        <w:gridCol w:w="3008"/>
+        <w:gridCol w:w="3008"/>
+        <w:gridCol w:w="3010"/>
       </w:tblGrid>
       <w:tr>
         <w:tc>
           <w:tcPr>
+            <w:tcW w:type="dxa" w:w="3008"/>
             <w:vAlign w:val="center"/>
           </w:tcPr>
           <w:p>
@@ -1696,12 +2068,15 @@
             </w:pPr>
             <w:r>
               <w:rPr>
+                <w:rFonts w:ascii="Calibri" w:cs="Calibri" w:eastAsia="Calibri" w:hAnsi="Calibri"/>
                 <w:b/>
                 <w:bCs/>
                 <w:i w:val="false"/>
                 <w:iCs w:val="false"/>
                 <w:strike w:val="false"/>
                 <w:color w:val="000000"/>
+                <w:sz w:val="24"/>
+                <w:szCs w:val="24"/>
               </w:rPr>
               <w:t xml:space="preserve">左对齐</w:t>
             </w:r>
@@ -1709,6 +2084,7 @@
         </w:tc>
         <w:tc>
           <w:tcPr>
+            <w:tcW w:type="dxa" w:w="3008"/>
             <w:vAlign w:val="center"/>
           </w:tcPr>
           <w:p>
@@ -1717,12 +2093,15 @@
             </w:pPr>
             <w:r>
               <w:rPr>
+                <w:rFonts w:ascii="Calibri" w:cs="Calibri" w:eastAsia="Calibri" w:hAnsi="Calibri"/>
                 <w:b/>
                 <w:bCs/>
                 <w:i w:val="false"/>
                 <w:iCs w:val="false"/>
                 <w:strike w:val="false"/>
                 <w:color w:val="000000"/>
+                <w:sz w:val="24"/>
+                <w:szCs w:val="24"/>
               </w:rPr>
               <w:t xml:space="preserve">居中对齐</w:t>
             </w:r>
@@ -1730,6 +2109,7 @@
         </w:tc>
         <w:tc>
           <w:tcPr>
+            <w:tcW w:type="dxa" w:w="3010"/>
             <w:vAlign w:val="center"/>
           </w:tcPr>
           <w:p>
@@ -1738,12 +2118,15 @@
             </w:pPr>
             <w:r>
               <w:rPr>
+                <w:rFonts w:ascii="Calibri" w:cs="Calibri" w:eastAsia="Calibri" w:hAnsi="Calibri"/>
                 <w:b/>
                 <w:bCs/>
                 <w:i w:val="false"/>
                 <w:iCs w:val="false"/>
                 <w:strike w:val="false"/>
                 <w:color w:val="000000"/>
+                <w:sz w:val="24"/>
+                <w:szCs w:val="24"/>
               </w:rPr>
               <w:t xml:space="preserve">右对齐</w:t>
             </w:r>
@@ -1753,6 +2136,7 @@
       <w:tr>
         <w:tc>
           <w:tcPr>
+            <w:tcW w:type="dxa" w:w="3008"/>
             <w:vAlign w:val="center"/>
           </w:tcPr>
           <w:p>
@@ -1761,12 +2145,15 @@
             </w:pPr>
             <w:r>
               <w:rPr>
+                <w:rFonts w:ascii="Calibri" w:cs="Calibri" w:eastAsia="Calibri" w:hAnsi="Calibri"/>
                 <w:b w:val="false"/>
                 <w:bCs w:val="false"/>
                 <w:i w:val="false"/>
                 <w:iCs w:val="false"/>
                 <w:strike w:val="false"/>
                 <w:color w:val="000000"/>
+                <w:sz w:val="24"/>
+                <w:szCs w:val="24"/>
               </w:rPr>
               <w:t xml:space="preserve">左1</w:t>
             </w:r>
@@ -1774,6 +2161,7 @@
         </w:tc>
         <w:tc>
           <w:tcPr>
+            <w:tcW w:type="dxa" w:w="3008"/>
             <w:vAlign w:val="center"/>
           </w:tcPr>
           <w:p>
@@ -1782,12 +2170,15 @@
             </w:pPr>
             <w:r>
               <w:rPr>
+                <w:rFonts w:ascii="Calibri" w:cs="Calibri" w:eastAsia="Calibri" w:hAnsi="Calibri"/>
                 <w:b w:val="false"/>
                 <w:bCs w:val="false"/>
                 <w:i w:val="false"/>
                 <w:iCs w:val="false"/>
                 <w:strike w:val="false"/>
                 <w:color w:val="000000"/>
+                <w:sz w:val="24"/>
+                <w:szCs w:val="24"/>
               </w:rPr>
               <w:t xml:space="preserve">中1</w:t>
             </w:r>
@@ -1795,6 +2186,7 @@
         </w:tc>
         <w:tc>
           <w:tcPr>
+            <w:tcW w:type="dxa" w:w="3010"/>
             <w:vAlign w:val="center"/>
           </w:tcPr>
           <w:p>
@@ -1803,12 +2195,15 @@
             </w:pPr>
             <w:r>
               <w:rPr>
+                <w:rFonts w:ascii="Calibri" w:cs="Calibri" w:eastAsia="Calibri" w:hAnsi="Calibri"/>
                 <w:b w:val="false"/>
                 <w:bCs w:val="false"/>
                 <w:i w:val="false"/>
                 <w:iCs w:val="false"/>
                 <w:strike w:val="false"/>
                 <w:color w:val="000000"/>
+                <w:sz w:val="24"/>
+                <w:szCs w:val="24"/>
               </w:rPr>
               <w:t xml:space="preserve">右1</w:t>
             </w:r>
@@ -1818,6 +2213,7 @@
       <w:tr>
         <w:tc>
           <w:tcPr>
+            <w:tcW w:type="dxa" w:w="3008"/>
             <w:vAlign w:val="center"/>
           </w:tcPr>
           <w:p>
@@ -1826,12 +2222,15 @@
             </w:pPr>
             <w:r>
               <w:rPr>
+                <w:rFonts w:ascii="Calibri" w:cs="Calibri" w:eastAsia="Calibri" w:hAnsi="Calibri"/>
                 <w:b w:val="false"/>
                 <w:bCs w:val="false"/>
                 <w:i w:val="false"/>
                 <w:iCs w:val="false"/>
                 <w:strike w:val="false"/>
                 <w:color w:val="000000"/>
+                <w:sz w:val="24"/>
+                <w:szCs w:val="24"/>
               </w:rPr>
               <w:t xml:space="preserve">左2</w:t>
             </w:r>
@@ -1839,6 +2238,7 @@
         </w:tc>
         <w:tc>
           <w:tcPr>
+            <w:tcW w:type="dxa" w:w="3008"/>
             <w:vAlign w:val="center"/>
           </w:tcPr>
           <w:p>
@@ -1847,12 +2247,15 @@
             </w:pPr>
             <w:r>
               <w:rPr>
+                <w:rFonts w:ascii="Calibri" w:cs="Calibri" w:eastAsia="Calibri" w:hAnsi="Calibri"/>
                 <w:b w:val="false"/>
                 <w:bCs w:val="false"/>
                 <w:i w:val="false"/>
                 <w:iCs w:val="false"/>
                 <w:strike w:val="false"/>
                 <w:color w:val="000000"/>
+                <w:sz w:val="24"/>
+                <w:szCs w:val="24"/>
               </w:rPr>
               <w:t xml:space="preserve">中2</w:t>
             </w:r>
@@ -1860,6 +2263,7 @@
         </w:tc>
         <w:tc>
           <w:tcPr>
+            <w:tcW w:type="dxa" w:w="3010"/>
             <w:vAlign w:val="center"/>
           </w:tcPr>
           <w:p>
@@ -1868,12 +2272,15 @@
             </w:pPr>
             <w:r>
               <w:rPr>
+                <w:rFonts w:ascii="Calibri" w:cs="Calibri" w:eastAsia="Calibri" w:hAnsi="Calibri"/>
                 <w:b w:val="false"/>
                 <w:bCs w:val="false"/>
                 <w:i w:val="false"/>
                 <w:iCs w:val="false"/>
                 <w:strike w:val="false"/>
                 <w:color w:val="000000"/>
+                <w:sz w:val="24"/>
+                <w:szCs w:val="24"/>
               </w:rPr>
               <w:t xml:space="preserve">右2</w:t>
             </w:r>
@@ -1883,6 +2290,7 @@
       <w:tr>
         <w:tc>
           <w:tcPr>
+            <w:tcW w:type="dxa" w:w="3008"/>
             <w:vAlign w:val="center"/>
           </w:tcPr>
           <w:p>
@@ -1891,34 +2299,43 @@
             </w:pPr>
             <w:r>
               <w:rPr>
+                <w:rFonts w:ascii="Calibri" w:cs="Calibri" w:eastAsia="Calibri" w:hAnsi="Calibri"/>
                 <w:b w:val="false"/>
                 <w:bCs w:val="false"/>
                 <w:i w:val="false"/>
                 <w:iCs w:val="false"/>
                 <w:strike w:val="false"/>
                 <w:color w:val="000000"/>
+                <w:sz w:val="24"/>
+                <w:szCs w:val="24"/>
               </w:rPr>
               <w:t xml:space="preserve"/>
             </w:r>
             <w:r>
               <w:rPr>
+                <w:rFonts w:ascii="Calibri" w:cs="Calibri" w:eastAsia="Calibri" w:hAnsi="Calibri"/>
                 <w:b/>
                 <w:bCs/>
                 <w:i w:val="false"/>
                 <w:iCs w:val="false"/>
                 <w:strike w:val="false"/>
                 <w:color w:val="000000"/>
+                <w:sz w:val="24"/>
+                <w:szCs w:val="24"/>
               </w:rPr>
               <w:t xml:space="preserve">粗体</w:t>
             </w:r>
             <w:r>
               <w:rPr>
+                <w:rFonts w:ascii="Calibri" w:cs="Calibri" w:eastAsia="Calibri" w:hAnsi="Calibri"/>
                 <w:b w:val="false"/>
                 <w:bCs w:val="false"/>
                 <w:i w:val="false"/>
                 <w:iCs w:val="false"/>
                 <w:strike w:val="false"/>
                 <w:color w:val="000000"/>
+                <w:sz w:val="24"/>
+                <w:szCs w:val="24"/>
               </w:rPr>
               <w:t xml:space="preserve"/>
             </w:r>
@@ -1926,6 +2343,7 @@
         </w:tc>
         <w:tc>
           <w:tcPr>
+            <w:tcW w:type="dxa" w:w="3008"/>
             <w:vAlign w:val="center"/>
           </w:tcPr>
           <w:p>
@@ -1934,12 +2352,15 @@
             </w:pPr>
             <w:r>
               <w:rPr>
+                <w:rFonts w:ascii="Calibri" w:cs="Calibri" w:eastAsia="Calibri" w:hAnsi="Calibri"/>
                 <w:b w:val="false"/>
                 <w:bCs w:val="false"/>
                 <w:i/>
                 <w:iCs/>
                 <w:strike w:val="false"/>
                 <w:color w:val="000000"/>
+                <w:sz w:val="24"/>
+                <w:szCs w:val="24"/>
               </w:rPr>
               <w:t xml:space="preserve">斜体</w:t>
             </w:r>
@@ -1947,6 +2368,7 @@
         </w:tc>
         <w:tc>
           <w:tcPr>
+            <w:tcW w:type="dxa" w:w="3010"/>
             <w:vAlign w:val="center"/>
           </w:tcPr>
           <w:p>
@@ -1955,12 +2377,15 @@
             </w:pPr>
             <w:r>
               <w:rPr>
+                <w:rFonts w:ascii="Calibri" w:cs="Calibri" w:eastAsia="Calibri" w:hAnsi="Calibri"/>
                 <w:b w:val="false"/>
                 <w:bCs w:val="false"/>
                 <w:i w:val="false"/>
                 <w:iCs w:val="false"/>
                 <w:strike/>
                 <w:color w:val="000000"/>
+                <w:sz w:val="24"/>
+                <w:szCs w:val="24"/>
               </w:rPr>
               <w:t xml:space="preserve">删除</w:t>
             </w:r>
@@ -1983,6 +2408,7 @@
       </w:pPr>
       <w:r>
         <w:rPr>
+          <w:rFonts w:ascii="Calibri" w:cs="Calibri" w:eastAsia="Calibri" w:hAnsi="Calibri"/>
           <w:b/>
           <w:bCs/>
           <w:color w:val="000000"/>
@@ -1999,6 +2425,7 @@
       </w:pPr>
       <w:r>
         <w:rPr>
+          <w:rFonts w:ascii="Calibri" w:cs="Calibri" w:eastAsia="Calibri" w:hAnsi="Calibri"/>
           <w:b/>
           <w:bCs/>
           <w:color w:val="000000"/>
@@ -2010,30 +2437,36 @@
     </w:p>
     <w:p>
       <w:pPr>
-        <w:spacing w:before="0" w:after="0"/>
-      </w:pPr>
-      <w:hyperlink w:history="1" r:id="rIdhav9f0z5jgycdbcfrt35p">
+        <w:spacing w:line="240" w:before="0" w:after="0"/>
+      </w:pPr>
+      <w:hyperlink w:history="1" r:id="rIdtlolecp7fgfgvpthfrytw">
         <w:r>
           <w:rPr>
+            <w:rFonts w:ascii="Calibri" w:cs="Calibri" w:eastAsia="Calibri" w:hAnsi="Calibri"/>
             <w:b w:val="false"/>
             <w:bCs w:val="false"/>
             <w:i w:val="false"/>
             <w:iCs w:val="false"/>
             <w:strike w:val="false"/>
-            <w:color w:val="0000FF"/>
-            <w:u w:val="single" w:color="0000FF"/>
+            <w:color w:val="000000"/>
+            <w:sz w:val="24"/>
+            <w:szCs w:val="24"/>
+            <w:u w:val="single" w:color="000000"/>
           </w:rPr>
           <w:t xml:space="preserve">GitHub</w:t>
         </w:r>
       </w:hyperlink>
       <w:r>
         <w:rPr>
-          <w:b w:val="false"/>
-          <w:bCs w:val="false"/>
-          <w:i w:val="false"/>
-          <w:iCs w:val="false"/>
-          <w:strike w:val="false"/>
-          <w:color w:val="000000"/>
+          <w:rFonts w:ascii="Calibri" w:cs="Calibri" w:eastAsia="Calibri" w:hAnsi="Calibri"/>
+          <w:b w:val="false"/>
+          <w:bCs w:val="false"/>
+          <w:i w:val="false"/>
+          <w:iCs w:val="false"/>
+          <w:strike w:val="false"/>
+          <w:color w:val="000000"/>
+          <w:sz w:val="24"/>
+          <w:szCs w:val="24"/>
         </w:rPr>
         <w:t xml:space="preserve"> - 代码托管平台</w:t>
       </w:r>
@@ -2045,6 +2478,7 @@
       </w:pPr>
       <w:r>
         <w:rPr>
+          <w:rFonts w:ascii="Calibri" w:cs="Calibri" w:eastAsia="Calibri" w:hAnsi="Calibri"/>
           <w:b/>
           <w:bCs/>
           <w:color w:val="000000"/>
@@ -2056,16 +2490,19 @@
     </w:p>
     <w:p>
       <w:pPr>
-        <w:spacing w:before="0" w:after="0"/>
-      </w:pPr>
-      <w:r>
-        <w:rPr>
-          <w:b w:val="false"/>
-          <w:bCs w:val="false"/>
-          <w:i w:val="false"/>
-          <w:iCs w:val="false"/>
-          <w:strike w:val="false"/>
-          <w:color w:val="000000"/>
+        <w:spacing w:line="240" w:before="0" w:after="0"/>
+      </w:pPr>
+      <w:r>
+        <w:rPr>
+          <w:rFonts w:ascii="Calibri" w:cs="Calibri" w:eastAsia="Calibri" w:hAnsi="Calibri"/>
+          <w:b w:val="false"/>
+          <w:bCs w:val="false"/>
+          <w:i w:val="false"/>
+          <w:iCs w:val="false"/>
+          <w:strike w:val="false"/>
+          <w:color w:val="000000"/>
+          <w:sz w:val="24"/>
+          <w:szCs w:val="24"/>
         </w:rPr>
         <w:t xml:space="preserve">由于这是测试文档，图片功能需要实际图片文件来测试。</w:t>
       </w:r>
@@ -2085,6 +2522,7 @@
       </w:pPr>
       <w:r>
         <w:rPr>
+          <w:rFonts w:ascii="Calibri" w:cs="Calibri" w:eastAsia="Calibri" w:hAnsi="Calibri"/>
           <w:b/>
           <w:bCs/>
           <w:color w:val="000000"/>
@@ -2101,6 +2539,7 @@
       </w:pPr>
       <w:r>
         <w:rPr>
+          <w:rFonts w:ascii="Calibri" w:cs="Calibri" w:eastAsia="Calibri" w:hAnsi="Calibri"/>
           <w:b/>
           <w:bCs/>
           <w:color w:val="000000"/>
@@ -2112,23 +2551,26 @@
     </w:p>
     <w:p>
       <w:pPr>
-        <w:spacing w:before="0" w:after="0"/>
-      </w:pPr>
-      <w:r>
-        <w:rPr>
-          <w:b w:val="false"/>
-          <w:bCs w:val="false"/>
-          <w:i w:val="false"/>
-          <w:iCs w:val="false"/>
-          <w:strike w:val="false"/>
-          <w:color w:val="000000"/>
+        <w:spacing w:line="240" w:before="0" w:after="0"/>
+      </w:pPr>
+      <w:r>
+        <w:rPr>
+          <w:rFonts w:ascii="Calibri" w:cs="Calibri" w:eastAsia="Calibri" w:hAnsi="Calibri"/>
+          <w:b w:val="false"/>
+          <w:bCs w:val="false"/>
+          <w:i w:val="false"/>
+          <w:iCs w:val="false"/>
+          <w:strike w:val="false"/>
+          <w:color w:val="000000"/>
+          <w:sz w:val="24"/>
+          <w:szCs w:val="24"/>
         </w:rPr>
         <w:t xml:space="preserve">爱因斯坦质能方程：</w:t>
       </w:r>
       <w:r>
         <w:drawing>
           <wp:inline distT="0" distB="0" distL="0" distR="0">
-            <wp:extent cx="857250" cy="285750"/>
+            <wp:extent cx="466725" cy="171450"/>
             <wp:effectExtent t="0" r="0" b="0" l="0"/>
             <wp:docPr id="1" name="" descr="" title=""/>
             <wp:cNvGraphicFramePr>
@@ -2153,7 +2595,7 @@
                   <pic:spPr bwMode="auto">
                     <a:xfrm>
                       <a:off x="0" y="0"/>
-                      <a:ext cx="857250" cy="285750"/>
+                      <a:ext cx="466725" cy="171450"/>
                     </a:xfrm>
                     <a:prstGeom prst="rect">
                       <a:avLst/>
@@ -2168,23 +2610,26 @@
     </w:p>
     <w:p>
       <w:pPr>
-        <w:spacing w:before="0" w:after="0"/>
-      </w:pPr>
-      <w:r>
-        <w:rPr>
-          <w:b w:val="false"/>
-          <w:bCs w:val="false"/>
-          <w:i w:val="false"/>
-          <w:iCs w:val="false"/>
-          <w:strike w:val="false"/>
-          <w:color w:val="000000"/>
+        <w:spacing w:line="240" w:before="0" w:after="0"/>
+      </w:pPr>
+      <w:r>
+        <w:rPr>
+          <w:rFonts w:ascii="Calibri" w:cs="Calibri" w:eastAsia="Calibri" w:hAnsi="Calibri"/>
+          <w:b w:val="false"/>
+          <w:bCs w:val="false"/>
+          <w:i w:val="false"/>
+          <w:iCs w:val="false"/>
+          <w:strike w:val="false"/>
+          <w:color w:val="000000"/>
+          <w:sz w:val="24"/>
+          <w:szCs w:val="24"/>
         </w:rPr>
         <w:t xml:space="preserve">二次公式：</w:t>
       </w:r>
       <w:r>
         <w:drawing>
           <wp:inline distT="0" distB="0" distL="0" distR="0">
-            <wp:extent cx="1276350" cy="285750"/>
+            <wp:extent cx="866775" cy="190500"/>
             <wp:effectExtent t="0" r="0" b="0" l="0"/>
             <wp:docPr id="1" name="" descr="" title=""/>
             <wp:cNvGraphicFramePr>
@@ -2209,7 +2654,7 @@
                   <pic:spPr bwMode="auto">
                     <a:xfrm>
                       <a:off x="0" y="0"/>
-                      <a:ext cx="1276350" cy="285750"/>
+                      <a:ext cx="866775" cy="190500"/>
                     </a:xfrm>
                     <a:prstGeom prst="rect">
                       <a:avLst/>
@@ -2224,23 +2669,26 @@
     </w:p>
     <w:p>
       <w:pPr>
-        <w:spacing w:before="0" w:after="0"/>
-      </w:pPr>
-      <w:r>
-        <w:rPr>
-          <w:b w:val="false"/>
-          <w:bCs w:val="false"/>
-          <w:i w:val="false"/>
-          <w:iCs w:val="false"/>
-          <w:strike w:val="false"/>
-          <w:color w:val="000000"/>
+        <w:spacing w:line="240" w:before="0" w:after="0"/>
+      </w:pPr>
+      <w:r>
+        <w:rPr>
+          <w:rFonts w:ascii="Calibri" w:cs="Calibri" w:eastAsia="Calibri" w:hAnsi="Calibri"/>
+          <w:b w:val="false"/>
+          <w:bCs w:val="false"/>
+          <w:i w:val="false"/>
+          <w:iCs w:val="false"/>
+          <w:strike w:val="false"/>
+          <w:color w:val="000000"/>
+          <w:sz w:val="24"/>
+          <w:szCs w:val="24"/>
         </w:rPr>
         <w:t xml:space="preserve">求和公式：</w:t>
       </w:r>
       <w:r>
         <w:drawing>
           <wp:inline distT="0" distB="0" distL="0" distR="0">
-            <wp:extent cx="1333500" cy="285750"/>
+            <wp:extent cx="866775" cy="190500"/>
             <wp:effectExtent t="0" r="0" b="0" l="0"/>
             <wp:docPr id="1" name="" descr="" title=""/>
             <wp:cNvGraphicFramePr>
@@ -2265,7 +2713,7 @@
                   <pic:spPr bwMode="auto">
                     <a:xfrm>
                       <a:off x="0" y="0"/>
-                      <a:ext cx="1333500" cy="285750"/>
+                      <a:ext cx="866775" cy="190500"/>
                     </a:xfrm>
                     <a:prstGeom prst="rect">
                       <a:avLst/>
@@ -2285,6 +2733,7 @@
       </w:pPr>
       <w:r>
         <w:rPr>
+          <w:rFonts w:ascii="Calibri" w:cs="Calibri" w:eastAsia="Calibri" w:hAnsi="Calibri"/>
           <w:b/>
           <w:bCs/>
           <w:color w:val="000000"/>
@@ -2302,7 +2751,7 @@
       <w:r>
         <w:drawing>
           <wp:inline distT="0" distB="0" distL="0" distR="0">
-            <wp:extent cx="4762500" cy="2495550"/>
+            <wp:extent cx="923925" cy="495300"/>
             <wp:effectExtent t="0" r="0" b="0" l="0"/>
             <wp:docPr id="1" name="" descr="" title=""/>
             <wp:cNvGraphicFramePr>
@@ -2327,7 +2776,7 @@
                   <pic:spPr bwMode="auto">
                     <a:xfrm>
                       <a:off x="0" y="0"/>
-                      <a:ext cx="4762500" cy="2495550"/>
+                      <a:ext cx="923925" cy="495300"/>
                     </a:xfrm>
                     <a:prstGeom prst="rect">
                       <a:avLst/>
@@ -2342,16 +2791,19 @@
     </w:p>
     <w:p>
       <w:pPr>
-        <w:spacing w:before="0" w:after="0"/>
-      </w:pPr>
-      <w:r>
-        <w:rPr>
-          <w:b w:val="false"/>
-          <w:bCs w:val="false"/>
-          <w:i w:val="false"/>
-          <w:iCs w:val="false"/>
-          <w:strike w:val="false"/>
-          <w:color w:val="000000"/>
+        <w:spacing w:line="240" w:before="0" w:after="0"/>
+      </w:pPr>
+      <w:r>
+        <w:rPr>
+          <w:rFonts w:ascii="Calibri" w:cs="Calibri" w:eastAsia="Calibri" w:hAnsi="Calibri"/>
+          <w:b w:val="false"/>
+          <w:bCs w:val="false"/>
+          <w:i w:val="false"/>
+          <w:iCs w:val="false"/>
+          <w:strike w:val="false"/>
+          <w:color w:val="000000"/>
+          <w:sz w:val="24"/>
+          <w:szCs w:val="24"/>
         </w:rPr>
         <w:t xml:space="preserve">矩阵：</w:t>
       </w:r>
@@ -2374,6 +2826,7 @@
       </w:pPr>
       <w:r>
         <w:rPr>
+          <w:rFonts w:ascii="Calibri" w:cs="Calibri" w:eastAsia="Calibri" w:hAnsi="Calibri"/>
           <w:b/>
           <w:bCs/>
           <w:color w:val="000000"/>
@@ -2385,68 +2838,86 @@
     </w:p>
     <w:p>
       <w:pPr>
-        <w:spacing w:before="0" w:after="0"/>
-      </w:pPr>
-      <w:r>
-        <w:rPr>
-          <w:b w:val="false"/>
-          <w:bCs w:val="false"/>
-          <w:i w:val="false"/>
-          <w:iCs w:val="false"/>
-          <w:strike w:val="false"/>
-          <w:color w:val="000000"/>
+        <w:spacing w:line="240" w:before="0" w:after="0"/>
+      </w:pPr>
+      <w:r>
+        <w:rPr>
+          <w:rFonts w:ascii="Calibri" w:cs="Calibri" w:eastAsia="Calibri" w:hAnsi="Calibri"/>
+          <w:b w:val="false"/>
+          <w:bCs w:val="false"/>
+          <w:i w:val="false"/>
+          <w:iCs w:val="false"/>
+          <w:strike w:val="false"/>
+          <w:color w:val="000000"/>
+          <w:sz w:val="24"/>
+          <w:szCs w:val="24"/>
         </w:rPr>
         <w:t xml:space="preserve">这是一段带有脚注的文本</w:t>
       </w:r>
       <w:r>
         <w:rPr>
+          <w:rFonts w:ascii="Calibri" w:cs="Calibri" w:eastAsia="Calibri" w:hAnsi="Calibri"/>
           <w:color w:val="0000FF"/>
+          <w:sz w:val="24"/>
+          <w:szCs w:val="24"/>
           <w:vertAlign w:val="superscript"/>
         </w:rPr>
         <w:t xml:space="preserve">[1]</w:t>
       </w:r>
       <w:r>
         <w:rPr>
-          <w:b w:val="false"/>
-          <w:bCs w:val="false"/>
-          <w:i w:val="false"/>
-          <w:iCs w:val="false"/>
-          <w:strike w:val="false"/>
-          <w:color w:val="000000"/>
+          <w:rFonts w:ascii="Calibri" w:cs="Calibri" w:eastAsia="Calibri" w:hAnsi="Calibri"/>
+          <w:b w:val="false"/>
+          <w:bCs w:val="false"/>
+          <w:i w:val="false"/>
+          <w:iCs w:val="false"/>
+          <w:strike w:val="false"/>
+          <w:color w:val="000000"/>
+          <w:sz w:val="24"/>
+          <w:szCs w:val="24"/>
         </w:rPr>
         <w:t xml:space="preserve">。</w:t>
       </w:r>
     </w:p>
     <w:p>
       <w:pPr>
-        <w:spacing w:before="0" w:after="0"/>
-      </w:pPr>
-      <w:r>
-        <w:rPr>
-          <w:b w:val="false"/>
-          <w:bCs w:val="false"/>
-          <w:i w:val="false"/>
-          <w:iCs w:val="false"/>
-          <w:strike w:val="false"/>
-          <w:color w:val="000000"/>
+        <w:spacing w:line="240" w:before="0" w:after="0"/>
+      </w:pPr>
+      <w:r>
+        <w:rPr>
+          <w:rFonts w:ascii="Calibri" w:cs="Calibri" w:eastAsia="Calibri" w:hAnsi="Calibri"/>
+          <w:b w:val="false"/>
+          <w:bCs w:val="false"/>
+          <w:i w:val="false"/>
+          <w:iCs w:val="false"/>
+          <w:strike w:val="false"/>
+          <w:color w:val="000000"/>
+          <w:sz w:val="24"/>
+          <w:szCs w:val="24"/>
         </w:rPr>
         <w:t xml:space="preserve">这里还有另一个脚注</w:t>
       </w:r>
       <w:r>
         <w:rPr>
+          <w:rFonts w:ascii="Calibri" w:cs="Calibri" w:eastAsia="Calibri" w:hAnsi="Calibri"/>
           <w:color w:val="0000FF"/>
+          <w:sz w:val="24"/>
+          <w:szCs w:val="24"/>
           <w:vertAlign w:val="superscript"/>
         </w:rPr>
         <w:t xml:space="preserve">[2]</w:t>
       </w:r>
       <w:r>
         <w:rPr>
-          <w:b w:val="false"/>
-          <w:bCs w:val="false"/>
-          <w:i w:val="false"/>
-          <w:iCs w:val="false"/>
-          <w:strike w:val="false"/>
-          <w:color w:val="000000"/>
+          <w:rFonts w:ascii="Calibri" w:cs="Calibri" w:eastAsia="Calibri" w:hAnsi="Calibri"/>
+          <w:b w:val="false"/>
+          <w:bCs w:val="false"/>
+          <w:i w:val="false"/>
+          <w:iCs w:val="false"/>
+          <w:strike w:val="false"/>
+          <w:color w:val="000000"/>
+          <w:sz w:val="24"/>
+          <w:szCs w:val="24"/>
         </w:rPr>
         <w:t xml:space="preserve">。</w:t>
       </w:r>
@@ -2466,6 +2937,7 @@
       </w:pPr>
       <w:r>
         <w:rPr>
+          <w:rFonts w:ascii="Calibri" w:cs="Calibri" w:eastAsia="Calibri" w:hAnsi="Calibri"/>
           <w:b/>
           <w:bCs/>
           <w:color w:val="000000"/>
@@ -2477,82 +2949,103 @@
     </w:p>
     <w:p>
       <w:pPr>
-        <w:spacing w:before="0" w:after="0"/>
-      </w:pPr>
-      <w:r>
-        <w:rPr>
-          <w:b w:val="false"/>
-          <w:bCs w:val="false"/>
-          <w:i w:val="false"/>
-          <w:iCs w:val="false"/>
-          <w:strike w:val="false"/>
-          <w:color w:val="000000"/>
+        <w:spacing w:line="240" w:before="0" w:after="0"/>
+      </w:pPr>
+      <w:r>
+        <w:rPr>
+          <w:rFonts w:ascii="Calibri" w:cs="Calibri" w:eastAsia="Calibri" w:hAnsi="Calibri"/>
+          <w:b w:val="false"/>
+          <w:bCs w:val="false"/>
+          <w:i w:val="false"/>
+          <w:iCs w:val="false"/>
+          <w:strike w:val="false"/>
+          <w:color w:val="000000"/>
+          <w:sz w:val="24"/>
+          <w:szCs w:val="24"/>
         </w:rPr>
         <w:t xml:space="preserve">这段文字包含</w:t>
       </w:r>
       <w:r>
         <w:rPr>
+          <w:rFonts w:ascii="Calibri" w:cs="Calibri" w:eastAsia="Calibri" w:hAnsi="Calibri"/>
           <w:b/>
           <w:bCs/>
           <w:i w:val="false"/>
           <w:iCs w:val="false"/>
           <w:strike w:val="false"/>
           <w:color w:val="000000"/>
+          <w:sz w:val="24"/>
+          <w:szCs w:val="24"/>
         </w:rPr>
         <w:t xml:space="preserve">粗体</w:t>
       </w:r>
       <w:r>
         <w:rPr>
-          <w:b w:val="false"/>
-          <w:bCs w:val="false"/>
-          <w:i w:val="false"/>
-          <w:iCs w:val="false"/>
-          <w:strike w:val="false"/>
-          <w:color w:val="000000"/>
+          <w:rFonts w:ascii="Calibri" w:cs="Calibri" w:eastAsia="Calibri" w:hAnsi="Calibri"/>
+          <w:b w:val="false"/>
+          <w:bCs w:val="false"/>
+          <w:i w:val="false"/>
+          <w:iCs w:val="false"/>
+          <w:strike w:val="false"/>
+          <w:color w:val="000000"/>
+          <w:sz w:val="24"/>
+          <w:szCs w:val="24"/>
         </w:rPr>
         <w:t xml:space="preserve">、</w:t>
       </w:r>
       <w:r>
         <w:rPr>
+          <w:rFonts w:ascii="Calibri" w:cs="Calibri" w:eastAsia="Calibri" w:hAnsi="Calibri"/>
           <w:b w:val="false"/>
           <w:bCs w:val="false"/>
           <w:i/>
           <w:iCs/>
           <w:strike w:val="false"/>
           <w:color w:val="000000"/>
+          <w:sz w:val="24"/>
+          <w:szCs w:val="24"/>
         </w:rPr>
         <w:t xml:space="preserve">斜体</w:t>
       </w:r>
       <w:r>
         <w:rPr>
-          <w:b w:val="false"/>
-          <w:bCs w:val="false"/>
-          <w:i w:val="false"/>
-          <w:iCs w:val="false"/>
-          <w:strike w:val="false"/>
-          <w:color w:val="000000"/>
+          <w:rFonts w:ascii="Calibri" w:cs="Calibri" w:eastAsia="Calibri" w:hAnsi="Calibri"/>
+          <w:b w:val="false"/>
+          <w:bCs w:val="false"/>
+          <w:i w:val="false"/>
+          <w:iCs w:val="false"/>
+          <w:strike w:val="false"/>
+          <w:color w:val="000000"/>
+          <w:sz w:val="24"/>
+          <w:szCs w:val="24"/>
         </w:rPr>
         <w:t xml:space="preserve">、</w:t>
       </w:r>
       <w:r>
         <w:rPr>
+          <w:rFonts w:ascii="Calibri" w:cs="Calibri" w:eastAsia="Calibri" w:hAnsi="Calibri"/>
           <w:b w:val="false"/>
           <w:bCs w:val="false"/>
           <w:i w:val="false"/>
           <w:iCs w:val="false"/>
           <w:strike/>
           <w:color w:val="000000"/>
+          <w:sz w:val="24"/>
+          <w:szCs w:val="24"/>
         </w:rPr>
         <w:t xml:space="preserve">删除线</w:t>
       </w:r>
       <w:r>
         <w:rPr>
-          <w:b w:val="false"/>
-          <w:bCs w:val="false"/>
-          <w:i w:val="false"/>
-          <w:iCs w:val="false"/>
-          <w:strike w:val="false"/>
-          <w:color w:val="000000"/>
+          <w:rFonts w:ascii="Calibri" w:cs="Calibri" w:eastAsia="Calibri" w:hAnsi="Calibri"/>
+          <w:b w:val="false"/>
+          <w:bCs w:val="false"/>
+          <w:i w:val="false"/>
+          <w:iCs w:val="false"/>
+          <w:strike w:val="false"/>
+          <w:color w:val="000000"/>
+          <w:sz w:val="24"/>
+          <w:szCs w:val="24"/>
         </w:rPr>
         <w:t xml:space="preserve">、</w:t>
       </w:r>
@@ -2560,64 +3053,81 @@
         <w:rPr>
           <w:rFonts w:ascii="Courier New" w:cs="Courier New" w:eastAsia="Courier New" w:hAnsi="Courier New"/>
           <w:color w:val="000000"/>
+          <w:sz w:val="24"/>
+          <w:szCs w:val="24"/>
           <w:shd w:fill="F2F2F2" w:color="auto" w:val="clear"/>
         </w:rPr>
         <w:t xml:space="preserve">行内代码</w:t>
       </w:r>
       <w:r>
         <w:rPr>
-          <w:b w:val="false"/>
-          <w:bCs w:val="false"/>
-          <w:i w:val="false"/>
-          <w:iCs w:val="false"/>
-          <w:strike w:val="false"/>
-          <w:color w:val="000000"/>
+          <w:rFonts w:ascii="Calibri" w:cs="Calibri" w:eastAsia="Calibri" w:hAnsi="Calibri"/>
+          <w:b w:val="false"/>
+          <w:bCs w:val="false"/>
+          <w:i w:val="false"/>
+          <w:iCs w:val="false"/>
+          <w:strike w:val="false"/>
+          <w:color w:val="000000"/>
+          <w:sz w:val="24"/>
+          <w:szCs w:val="24"/>
         </w:rPr>
         <w:t xml:space="preserve">、H</w:t>
       </w:r>
       <w:r>
         <w:rPr>
-          <w:b w:val="false"/>
-          <w:bCs w:val="false"/>
-          <w:i w:val="false"/>
-          <w:iCs w:val="false"/>
-          <w:strike w:val="false"/>
-          <w:color w:val="000000"/>
+          <w:rFonts w:ascii="Calibri" w:cs="Calibri" w:eastAsia="Calibri" w:hAnsi="Calibri"/>
+          <w:b w:val="false"/>
+          <w:bCs w:val="false"/>
+          <w:i w:val="false"/>
+          <w:iCs w:val="false"/>
+          <w:strike w:val="false"/>
+          <w:color w:val="000000"/>
+          <w:sz w:val="24"/>
+          <w:szCs w:val="24"/>
           <w:vertAlign w:val="subscript"/>
         </w:rPr>
         <w:t xml:space="preserve">2</w:t>
       </w:r>
       <w:r>
         <w:rPr>
-          <w:b w:val="false"/>
-          <w:bCs w:val="false"/>
-          <w:i w:val="false"/>
-          <w:iCs w:val="false"/>
-          <w:strike w:val="false"/>
-          <w:color w:val="000000"/>
+          <w:rFonts w:ascii="Calibri" w:cs="Calibri" w:eastAsia="Calibri" w:hAnsi="Calibri"/>
+          <w:b w:val="false"/>
+          <w:bCs w:val="false"/>
+          <w:i w:val="false"/>
+          <w:iCs w:val="false"/>
+          <w:strike w:val="false"/>
+          <w:color w:val="000000"/>
+          <w:sz w:val="24"/>
+          <w:szCs w:val="24"/>
         </w:rPr>
         <w:t xml:space="preserve">O（下标）和 E=mc</w:t>
       </w:r>
       <w:r>
         <w:rPr>
-          <w:b w:val="false"/>
-          <w:bCs w:val="false"/>
-          <w:i w:val="false"/>
-          <w:iCs w:val="false"/>
-          <w:strike w:val="false"/>
-          <w:color w:val="000000"/>
+          <w:rFonts w:ascii="Calibri" w:cs="Calibri" w:eastAsia="Calibri" w:hAnsi="Calibri"/>
+          <w:b w:val="false"/>
+          <w:bCs w:val="false"/>
+          <w:i w:val="false"/>
+          <w:iCs w:val="false"/>
+          <w:strike w:val="false"/>
+          <w:color w:val="000000"/>
+          <w:sz w:val="24"/>
+          <w:szCs w:val="24"/>
           <w:vertAlign w:val="superscript"/>
         </w:rPr>
         <w:t xml:space="preserve">2</w:t>
       </w:r>
       <w:r>
         <w:rPr>
-          <w:b w:val="false"/>
-          <w:bCs w:val="false"/>
-          <w:i w:val="false"/>
-          <w:iCs w:val="false"/>
-          <w:strike w:val="false"/>
-          <w:color w:val="000000"/>
+          <w:rFonts w:ascii="Calibri" w:cs="Calibri" w:eastAsia="Calibri" w:hAnsi="Calibri"/>
+          <w:b w:val="false"/>
+          <w:bCs w:val="false"/>
+          <w:i w:val="false"/>
+          <w:iCs w:val="false"/>
+          <w:strike w:val="false"/>
+          <w:color w:val="000000"/>
+          <w:sz w:val="24"/>
+          <w:szCs w:val="24"/>
         </w:rPr>
         <w:t xml:space="preserve">（上标）的组合使用。</w:t>
       </w:r>
@@ -2633,34 +3143,43 @@
       </w:pPr>
       <w:r>
         <w:rPr>
-          <w:b w:val="false"/>
-          <w:bCs w:val="false"/>
-          <w:i w:val="false"/>
-          <w:iCs w:val="false"/>
-          <w:strike w:val="false"/>
-          <w:color w:val="000000"/>
+          <w:rFonts w:ascii="Calibri" w:cs="Calibri" w:eastAsia="Calibri" w:hAnsi="Calibri"/>
+          <w:b w:val="false"/>
+          <w:bCs w:val="false"/>
+          <w:i w:val="false"/>
+          <w:iCs w:val="false"/>
+          <w:strike w:val="false"/>
+          <w:color w:val="000000"/>
+          <w:sz w:val="24"/>
+          <w:szCs w:val="24"/>
         </w:rPr>
         <w:t xml:space="preserve">引用块中也可以包含</w:t>
       </w:r>
       <w:r>
         <w:rPr>
+          <w:rFonts w:ascii="Calibri" w:cs="Calibri" w:eastAsia="Calibri" w:hAnsi="Calibri"/>
           <w:b/>
           <w:bCs/>
           <w:i w:val="false"/>
           <w:iCs w:val="false"/>
           <w:strike w:val="false"/>
           <w:color w:val="000000"/>
+          <w:sz w:val="24"/>
+          <w:szCs w:val="24"/>
         </w:rPr>
         <w:t xml:space="preserve">格式化文本</w:t>
       </w:r>
       <w:r>
         <w:rPr>
-          <w:b w:val="false"/>
-          <w:bCs w:val="false"/>
-          <w:i w:val="false"/>
-          <w:iCs w:val="false"/>
-          <w:strike w:val="false"/>
-          <w:color w:val="000000"/>
+          <w:rFonts w:ascii="Calibri" w:cs="Calibri" w:eastAsia="Calibri" w:hAnsi="Calibri"/>
+          <w:b w:val="false"/>
+          <w:bCs w:val="false"/>
+          <w:i w:val="false"/>
+          <w:iCs w:val="false"/>
+          <w:strike w:val="false"/>
+          <w:color w:val="000000"/>
+          <w:sz w:val="24"/>
+          <w:szCs w:val="24"/>
         </w:rPr>
         <w:t xml:space="preserve">和 </w:t>
       </w:r>
@@ -2668,18 +3187,23 @@
         <w:rPr>
           <w:rFonts w:ascii="Courier New" w:cs="Courier New" w:eastAsia="Courier New" w:hAnsi="Courier New"/>
           <w:color w:val="000000"/>
+          <w:sz w:val="24"/>
+          <w:szCs w:val="24"/>
           <w:shd w:fill="F2F2F2" w:color="auto" w:val="clear"/>
         </w:rPr>
         <w:t xml:space="preserve">代码</w:t>
       </w:r>
       <w:r>
         <w:rPr>
-          <w:b w:val="false"/>
-          <w:bCs w:val="false"/>
-          <w:i w:val="false"/>
-          <w:iCs w:val="false"/>
-          <w:strike w:val="false"/>
-          <w:color w:val="000000"/>
+          <w:rFonts w:ascii="Calibri" w:cs="Calibri" w:eastAsia="Calibri" w:hAnsi="Calibri"/>
+          <w:b w:val="false"/>
+          <w:bCs w:val="false"/>
+          <w:i w:val="false"/>
+          <w:iCs w:val="false"/>
+          <w:strike w:val="false"/>
+          <w:color w:val="000000"/>
+          <w:sz w:val="24"/>
+          <w:szCs w:val="24"/>
         </w:rPr>
         <w:t xml:space="preserve">，</w:t>
       </w:r>
@@ -2688,12 +3212,15 @@
       </w:r>
       <w:r>
         <w:rPr>
-          <w:b w:val="false"/>
-          <w:bCs w:val="false"/>
-          <w:i w:val="false"/>
-          <w:iCs w:val="false"/>
-          <w:strike w:val="false"/>
-          <w:color w:val="000000"/>
+          <w:rFonts w:ascii="Calibri" w:cs="Calibri" w:eastAsia="Calibri" w:hAnsi="Calibri"/>
+          <w:b w:val="false"/>
+          <w:bCs w:val="false"/>
+          <w:i w:val="false"/>
+          <w:iCs w:val="false"/>
+          <w:strike w:val="false"/>
+          <w:color w:val="000000"/>
+          <w:sz w:val="24"/>
+          <w:szCs w:val="24"/>
         </w:rPr>
         <w:t xml:space="preserve">以及列表：</w:t>
       </w:r>
@@ -2709,12 +3236,15 @@
       </w:pPr>
       <w:r>
         <w:rPr>
-          <w:b w:val="false"/>
-          <w:bCs w:val="false"/>
-          <w:i w:val="false"/>
-          <w:iCs w:val="false"/>
-          <w:strike w:val="false"/>
-          <w:color w:val="000000"/>
+          <w:rFonts w:ascii="Calibri" w:cs="Calibri" w:eastAsia="Calibri" w:hAnsi="Calibri"/>
+          <w:b w:val="false"/>
+          <w:bCs w:val="false"/>
+          <w:i w:val="false"/>
+          <w:iCs w:val="false"/>
+          <w:strike w:val="false"/>
+          <w:color w:val="000000"/>
+          <w:sz w:val="24"/>
+          <w:szCs w:val="24"/>
         </w:rPr>
         <w:t xml:space="preserve">引用中的列表项 1</w:t>
       </w:r>
@@ -2730,12 +3260,15 @@
       </w:pPr>
       <w:r>
         <w:rPr>
-          <w:b w:val="false"/>
-          <w:bCs w:val="false"/>
-          <w:i w:val="false"/>
-          <w:iCs w:val="false"/>
-          <w:strike w:val="false"/>
-          <w:color w:val="000000"/>
+          <w:rFonts w:ascii="Calibri" w:cs="Calibri" w:eastAsia="Calibri" w:hAnsi="Calibri"/>
+          <w:b w:val="false"/>
+          <w:bCs w:val="false"/>
+          <w:i w:val="false"/>
+          <w:iCs w:val="false"/>
+          <w:strike w:val="false"/>
+          <w:color w:val="000000"/>
+          <w:sz w:val="24"/>
+          <w:szCs w:val="24"/>
         </w:rPr>
         <w:t xml:space="preserve">引用中的列表项 2</w:t>
       </w:r>
@@ -2750,48 +3283,57 @@
     </w:p>
     <w:p>
       <w:pPr>
-        <w:spacing w:before="0" w:after="0"/>
-      </w:pPr>
-      <w:r>
-        <w:rPr>
-          <w:b w:val="false"/>
-          <w:bCs w:val="false"/>
-          <w:i w:val="false"/>
-          <w:iCs w:val="false"/>
-          <w:strike w:val="false"/>
-          <w:color w:val="000000"/>
+        <w:spacing w:line="240" w:before="0" w:after="0"/>
+      </w:pPr>
+      <w:r>
+        <w:rPr>
+          <w:rFonts w:ascii="Calibri" w:cs="Calibri" w:eastAsia="Calibri" w:hAnsi="Calibri"/>
+          <w:b w:val="false"/>
+          <w:bCs w:val="false"/>
+          <w:i w:val="false"/>
+          <w:iCs w:val="false"/>
+          <w:strike w:val="false"/>
+          <w:color w:val="000000"/>
+          <w:sz w:val="24"/>
+          <w:szCs w:val="24"/>
         </w:rPr>
         <w:t xml:space="preserve">测试完成！</w:t>
       </w:r>
     </w:p>
     <w:p>
       <w:pPr>
-        <w:spacing w:before="0" w:after="0"/>
-      </w:pPr>
-      <w:r>
-        <w:rPr>
-          <w:b w:val="false"/>
-          <w:bCs w:val="false"/>
-          <w:i w:val="false"/>
-          <w:iCs w:val="false"/>
-          <w:strike w:val="false"/>
-          <w:color w:val="000000"/>
+        <w:spacing w:line="240" w:before="0" w:after="0"/>
+      </w:pPr>
+      <w:r>
+        <w:rPr>
+          <w:rFonts w:ascii="Calibri" w:cs="Calibri" w:eastAsia="Calibri" w:hAnsi="Calibri"/>
+          <w:b w:val="false"/>
+          <w:bCs w:val="false"/>
+          <w:i w:val="false"/>
+          <w:iCs w:val="false"/>
+          <w:strike w:val="false"/>
+          <w:color w:val="000000"/>
+          <w:sz w:val="24"/>
+          <w:szCs w:val="24"/>
         </w:rPr>
         <w:t xml:space="preserve">这是第一个脚注的内容。</w:t>
       </w:r>
     </w:p>
     <w:p>
       <w:pPr>
-        <w:spacing w:before="0" w:after="0"/>
-      </w:pPr>
-      <w:r>
-        <w:rPr>
-          <w:b w:val="false"/>
-          <w:bCs w:val="false"/>
-          <w:i w:val="false"/>
-          <w:iCs w:val="false"/>
-          <w:strike w:val="false"/>
-          <w:color w:val="000000"/>
+        <w:spacing w:line="240" w:before="0" w:after="0"/>
+      </w:pPr>
+      <w:r>
+        <w:rPr>
+          <w:rFonts w:ascii="Calibri" w:cs="Calibri" w:eastAsia="Calibri" w:hAnsi="Calibri"/>
+          <w:b w:val="false"/>
+          <w:bCs w:val="false"/>
+          <w:i w:val="false"/>
+          <w:iCs w:val="false"/>
+          <w:strike w:val="false"/>
+          <w:color w:val="000000"/>
+          <w:sz w:val="24"/>
+          <w:szCs w:val="24"/>
         </w:rPr>
         <w:t xml:space="preserve">这是一个命名脚注的内容。</w:t>
       </w:r>

</xml_diff>